<commit_message>
Highlight years with negative gold performance in red (2008-2013)
Co-Authored-By: Claude Opus 4.6 <noreply@anthropic.com>
</commit_message>
<xml_diff>
--- a/Gold_vs_Aktien_Bericht.docx
+++ b/Gold_vs_Aktien_Bericht.docx
@@ -1492,6 +1492,7 @@
             </w:pPr>
             <w:r>
               <w:rPr>
+                <w:color w:val="CC0000"/>
                 <w:sz w:val="16"/>
               </w:rPr>
               <w:t>2008</w:t>
@@ -1508,6 +1509,7 @@
             </w:pPr>
             <w:r>
               <w:rPr>
+                <w:color w:val="CC0000"/>
                 <w:sz w:val="16"/>
               </w:rPr>
               <w:t>18</w:t>
@@ -1524,6 +1526,7 @@
             </w:pPr>
             <w:r>
               <w:rPr>
+                <w:color w:val="CC0000"/>
                 <w:sz w:val="16"/>
               </w:rPr>
               <w:t>€4,234</w:t>
@@ -1540,6 +1543,7 @@
             </w:pPr>
             <w:r>
               <w:rPr>
+                <w:color w:val="CC0000"/>
                 <w:sz w:val="16"/>
               </w:rPr>
               <w:t>8.3%</w:t>
@@ -1556,6 +1560,7 @@
             </w:pPr>
             <w:r>
               <w:rPr>
+                <w:color w:val="CC0000"/>
                 <w:sz w:val="16"/>
               </w:rPr>
               <w:t>€4,476</w:t>
@@ -1572,6 +1577,7 @@
             </w:pPr>
             <w:r>
               <w:rPr>
+                <w:color w:val="CC0000"/>
                 <w:sz w:val="16"/>
               </w:rPr>
               <w:t>8.6%</w:t>
@@ -1588,6 +1594,7 @@
             </w:pPr>
             <w:r>
               <w:rPr>
+                <w:color w:val="CC0000"/>
                 <w:sz w:val="16"/>
               </w:rPr>
               <w:t>€1,847</w:t>
@@ -1604,6 +1611,7 @@
             </w:pPr>
             <w:r>
               <w:rPr>
+                <w:color w:val="CC0000"/>
                 <w:sz w:val="16"/>
               </w:rPr>
               <w:t>3.4%</w:t>
@@ -1639,6 +1647,7 @@
             </w:pPr>
             <w:r>
               <w:rPr>
+                <w:color w:val="CC0000"/>
                 <w:sz w:val="16"/>
               </w:rPr>
               <w:t>2009</w:t>
@@ -1655,6 +1664,7 @@
             </w:pPr>
             <w:r>
               <w:rPr>
+                <w:color w:val="CC0000"/>
                 <w:sz w:val="16"/>
               </w:rPr>
               <w:t>17</w:t>
@@ -1671,6 +1681,7 @@
             </w:pPr>
             <w:r>
               <w:rPr>
+                <w:color w:val="CC0000"/>
                 <w:sz w:val="16"/>
               </w:rPr>
               <w:t>€4,888</w:t>
@@ -1687,6 +1698,7 @@
             </w:pPr>
             <w:r>
               <w:rPr>
+                <w:color w:val="CC0000"/>
                 <w:sz w:val="16"/>
               </w:rPr>
               <w:t>9.7%</w:t>
@@ -1703,6 +1715,7 @@
             </w:pPr>
             <w:r>
               <w:rPr>
+                <w:color w:val="CC0000"/>
                 <w:sz w:val="16"/>
               </w:rPr>
               <w:t>€8,298</w:t>
@@ -1719,6 +1732,7 @@
             </w:pPr>
             <w:r>
               <w:rPr>
+                <w:color w:val="CC0000"/>
                 <w:sz w:val="16"/>
               </w:rPr>
               <w:t>13.2%</w:t>
@@ -1735,6 +1749,7 @@
             </w:pPr>
             <w:r>
               <w:rPr>
+                <w:color w:val="CC0000"/>
                 <w:sz w:val="16"/>
               </w:rPr>
               <w:t>€3,718</w:t>
@@ -1751,6 +1766,7 @@
             </w:pPr>
             <w:r>
               <w:rPr>
+                <w:color w:val="CC0000"/>
                 <w:sz w:val="16"/>
               </w:rPr>
               <w:t>8.0%</w:t>
@@ -1786,6 +1802,7 @@
             </w:pPr>
             <w:r>
               <w:rPr>
+                <w:color w:val="CC0000"/>
                 <w:sz w:val="16"/>
               </w:rPr>
               <w:t>2010</w:t>
@@ -1802,6 +1819,7 @@
             </w:pPr>
             <w:r>
               <w:rPr>
+                <w:color w:val="CC0000"/>
                 <w:sz w:val="16"/>
               </w:rPr>
               <w:t>16</w:t>
@@ -1818,6 +1836,7 @@
             </w:pPr>
             <w:r>
               <w:rPr>
+                <w:color w:val="CC0000"/>
                 <w:sz w:val="16"/>
               </w:rPr>
               <w:t>€3,840</w:t>
@@ -1834,6 +1853,7 @@
             </w:pPr>
             <w:r>
               <w:rPr>
+                <w:color w:val="CC0000"/>
                 <w:sz w:val="16"/>
               </w:rPr>
               <w:t>8.7%</w:t>
@@ -1850,6 +1870,7 @@
             </w:pPr>
             <w:r>
               <w:rPr>
+                <w:color w:val="CC0000"/>
                 <w:sz w:val="16"/>
               </w:rPr>
               <w:t>€5,777</w:t>
@@ -1866,6 +1887,7 @@
             </w:pPr>
             <w:r>
               <w:rPr>
+                <w:color w:val="CC0000"/>
                 <w:sz w:val="16"/>
               </w:rPr>
               <w:t>11.5%</w:t>
@@ -1882,6 +1904,7 @@
             </w:pPr>
             <w:r>
               <w:rPr>
+                <w:color w:val="CC0000"/>
                 <w:sz w:val="16"/>
               </w:rPr>
               <w:t>€2,486</w:t>
@@ -1898,6 +1921,7 @@
             </w:pPr>
             <w:r>
               <w:rPr>
+                <w:color w:val="CC0000"/>
                 <w:sz w:val="16"/>
               </w:rPr>
               <w:t>5.8%</w:t>
@@ -1933,6 +1957,7 @@
             </w:pPr>
             <w:r>
               <w:rPr>
+                <w:color w:val="CC0000"/>
                 <w:sz w:val="16"/>
               </w:rPr>
               <w:t>2011</w:t>
@@ -1949,6 +1974,7 @@
             </w:pPr>
             <w:r>
               <w:rPr>
+                <w:color w:val="CC0000"/>
                 <w:sz w:val="16"/>
               </w:rPr>
               <w:t>15</w:t>
@@ -1965,6 +1991,7 @@
             </w:pPr>
             <w:r>
               <w:rPr>
+                <w:color w:val="CC0000"/>
                 <w:sz w:val="16"/>
               </w:rPr>
               <w:t>€3,181</w:t>
@@ -1981,6 +2008,7 @@
             </w:pPr>
             <w:r>
               <w:rPr>
+                <w:color w:val="CC0000"/>
                 <w:sz w:val="16"/>
               </w:rPr>
               <w:t>8.0%</w:t>
@@ -1997,6 +2025,7 @@
             </w:pPr>
             <w:r>
               <w:rPr>
+                <w:color w:val="CC0000"/>
                 <w:sz w:val="16"/>
               </w:rPr>
               <w:t>€4,853</w:t>
@@ -2013,6 +2042,7 @@
             </w:pPr>
             <w:r>
               <w:rPr>
+                <w:color w:val="CC0000"/>
                 <w:sz w:val="16"/>
               </w:rPr>
               <w:t>11.0%</w:t>
@@ -2029,6 +2059,7 @@
             </w:pPr>
             <w:r>
               <w:rPr>
+                <w:color w:val="CC0000"/>
                 <w:sz w:val="16"/>
               </w:rPr>
               <w:t>€2,082</w:t>
@@ -2045,6 +2076,7 @@
             </w:pPr>
             <w:r>
               <w:rPr>
+                <w:color w:val="CC0000"/>
                 <w:sz w:val="16"/>
               </w:rPr>
               <w:t>5.0%</w:t>
@@ -2080,6 +2112,7 @@
             </w:pPr>
             <w:r>
               <w:rPr>
+                <w:color w:val="CC0000"/>
                 <w:sz w:val="16"/>
               </w:rPr>
               <w:t>2012</w:t>
@@ -2096,6 +2129,7 @@
             </w:pPr>
             <w:r>
               <w:rPr>
+                <w:color w:val="CC0000"/>
                 <w:sz w:val="16"/>
               </w:rPr>
               <w:t>14</w:t>
@@ -2112,6 +2146,7 @@
             </w:pPr>
             <w:r>
               <w:rPr>
+                <w:color w:val="CC0000"/>
                 <w:sz w:val="16"/>
               </w:rPr>
               <w:t>€2,537</w:t>
@@ -2128,6 +2163,7 @@
             </w:pPr>
             <w:r>
               <w:rPr>
+                <w:color w:val="CC0000"/>
                 <w:sz w:val="16"/>
               </w:rPr>
               <w:t>6.8%</w:t>
@@ -2144,6 +2180,7 @@
             </w:pPr>
             <w:r>
               <w:rPr>
+                <w:color w:val="CC0000"/>
                 <w:sz w:val="16"/>
               </w:rPr>
               <w:t>€4,840</w:t>
@@ -2160,6 +2197,7 @@
             </w:pPr>
             <w:r>
               <w:rPr>
+                <w:color w:val="CC0000"/>
                 <w:sz w:val="16"/>
               </w:rPr>
               <w:t>11.8%</w:t>
@@ -2176,6 +2214,7 @@
             </w:pPr>
             <w:r>
               <w:rPr>
+                <w:color w:val="CC0000"/>
                 <w:sz w:val="16"/>
               </w:rPr>
               <w:t>€2,430</w:t>
@@ -2192,6 +2231,7 @@
             </w:pPr>
             <w:r>
               <w:rPr>
+                <w:color w:val="CC0000"/>
                 <w:sz w:val="16"/>
               </w:rPr>
               <w:t>6.5%</w:t>
@@ -2227,6 +2267,7 @@
             </w:pPr>
             <w:r>
               <w:rPr>
+                <w:color w:val="CC0000"/>
                 <w:sz w:val="16"/>
               </w:rPr>
               <w:t>2013</w:t>
@@ -2243,6 +2284,7 @@
             </w:pPr>
             <w:r>
               <w:rPr>
+                <w:color w:val="CC0000"/>
                 <w:sz w:val="16"/>
               </w:rPr>
               <w:t>13</w:t>
@@ -2259,6 +2301,7 @@
             </w:pPr>
             <w:r>
               <w:rPr>
+                <w:color w:val="CC0000"/>
                 <w:sz w:val="16"/>
               </w:rPr>
               <w:t>€2,582</w:t>
@@ -2275,6 +2318,7 @@
             </w:pPr>
             <w:r>
               <w:rPr>
+                <w:color w:val="CC0000"/>
                 <w:sz w:val="16"/>
               </w:rPr>
               <w:t>7.5%</w:t>
@@ -2291,6 +2335,7 @@
             </w:pPr>
             <w:r>
               <w:rPr>
+                <w:color w:val="CC0000"/>
                 <w:sz w:val="16"/>
               </w:rPr>
               <w:t>€4,061</w:t>
@@ -2307,6 +2352,7 @@
             </w:pPr>
             <w:r>
               <w:rPr>
+                <w:color w:val="CC0000"/>
                 <w:sz w:val="16"/>
               </w:rPr>
               <w:t>11.3%</w:t>
@@ -2323,6 +2369,7 @@
             </w:pPr>
             <w:r>
               <w:rPr>
+                <w:color w:val="CC0000"/>
                 <w:sz w:val="16"/>
               </w:rPr>
               <w:t>€1,948</w:t>
@@ -2339,6 +2386,7 @@
             </w:pPr>
             <w:r>
               <w:rPr>
+                <w:color w:val="CC0000"/>
                 <w:sz w:val="16"/>
               </w:rPr>
               <w:t>5.2%</w:t>

</xml_diff>

<commit_message>
Red rows for negative gold years, no-wrap table cells in all reports
Co-Authored-By: Claude Opus 4.6 <noreply@anthropic.com>
</commit_message>
<xml_diff>
--- a/Gold_vs_Aktien_Bericht.docx
+++ b/Gold_vs_Aktien_Bericht.docx
@@ -135,9 +135,9 @@
     <w:tbl>
       <w:tblPr>
         <w:tblStyle w:val="LightShading-Accent1"/>
-        <w:tblW w:type="auto" w:w="0"/>
         <w:jc w:val="center"/>
         <w:tblLook w:firstColumn="1" w:firstRow="1" w:lastColumn="0" w:lastRow="0" w:noHBand="0" w:noVBand="1" w:val="04A0"/>
+        <w:tblLayout w:type="autofit"/>
       </w:tblPr>
       <w:tblGrid>
         <w:gridCol w:w="960"/>
@@ -154,6 +154,7 @@
         <w:tc>
           <w:tcPr>
             <w:tcW w:type="dxa" w:w="960"/>
+            <w:noWrap/>
           </w:tcPr>
           <w:p>
             <w:pPr>
@@ -162,7 +163,7 @@
             <w:r>
               <w:rPr>
                 <w:b/>
-                <w:sz w:val="16"/>
+                <w:sz w:val="18"/>
               </w:rPr>
               <w:t>Start</w:t>
             </w:r>
@@ -171,6 +172,7 @@
         <w:tc>
           <w:tcPr>
             <w:tcW w:type="dxa" w:w="960"/>
+            <w:noWrap/>
           </w:tcPr>
           <w:p>
             <w:pPr>
@@ -179,7 +181,7 @@
             <w:r>
               <w:rPr>
                 <w:b/>
-                <w:sz w:val="16"/>
+                <w:sz w:val="18"/>
               </w:rPr>
               <w:t>Jahre</w:t>
             </w:r>
@@ -188,6 +190,7 @@
         <w:tc>
           <w:tcPr>
             <w:tcW w:type="dxa" w:w="960"/>
+            <w:noWrap/>
           </w:tcPr>
           <w:p>
             <w:pPr>
@@ -196,7 +199,7 @@
             <w:r>
               <w:rPr>
                 <w:b/>
-                <w:sz w:val="16"/>
+                <w:sz w:val="18"/>
               </w:rPr>
               <w:t>Gold netto</w:t>
             </w:r>
@@ -205,6 +208,7 @@
         <w:tc>
           <w:tcPr>
             <w:tcW w:type="dxa" w:w="960"/>
+            <w:noWrap/>
           </w:tcPr>
           <w:p>
             <w:pPr>
@@ -213,7 +217,7 @@
             <w:r>
               <w:rPr>
                 <w:b/>
-                <w:sz w:val="16"/>
+                <w:sz w:val="18"/>
               </w:rPr>
               <w:t>Gold CAGR</w:t>
             </w:r>
@@ -222,6 +226,7 @@
         <w:tc>
           <w:tcPr>
             <w:tcW w:type="dxa" w:w="960"/>
+            <w:noWrap/>
           </w:tcPr>
           <w:p>
             <w:pPr>
@@ -230,7 +235,7 @@
             <w:r>
               <w:rPr>
                 <w:b/>
-                <w:sz w:val="16"/>
+                <w:sz w:val="18"/>
               </w:rPr>
               <w:t>S&amp;P 500 netto</w:t>
             </w:r>
@@ -239,6 +244,7 @@
         <w:tc>
           <w:tcPr>
             <w:tcW w:type="dxa" w:w="960"/>
+            <w:noWrap/>
           </w:tcPr>
           <w:p>
             <w:pPr>
@@ -247,7 +253,7 @@
             <w:r>
               <w:rPr>
                 <w:b/>
-                <w:sz w:val="16"/>
+                <w:sz w:val="18"/>
               </w:rPr>
               <w:t>S&amp;P CAGR</w:t>
             </w:r>
@@ -256,6 +262,7 @@
         <w:tc>
           <w:tcPr>
             <w:tcW w:type="dxa" w:w="960"/>
+            <w:noWrap/>
           </w:tcPr>
           <w:p>
             <w:pPr>
@@ -264,7 +271,7 @@
             <w:r>
               <w:rPr>
                 <w:b/>
-                <w:sz w:val="16"/>
+                <w:sz w:val="18"/>
               </w:rPr>
               <w:t>DAX netto</w:t>
             </w:r>
@@ -273,6 +280,7 @@
         <w:tc>
           <w:tcPr>
             <w:tcW w:type="dxa" w:w="960"/>
+            <w:noWrap/>
           </w:tcPr>
           <w:p>
             <w:pPr>
@@ -281,7 +289,7 @@
             <w:r>
               <w:rPr>
                 <w:b/>
-                <w:sz w:val="16"/>
+                <w:sz w:val="18"/>
               </w:rPr>
               <w:t>DAX CAGR</w:t>
             </w:r>
@@ -290,6 +298,7 @@
         <w:tc>
           <w:tcPr>
             <w:tcW w:type="dxa" w:w="960"/>
+            <w:noWrap/>
           </w:tcPr>
           <w:p>
             <w:pPr>
@@ -298,7 +307,7 @@
             <w:r>
               <w:rPr>
                 <w:b/>
-                <w:sz w:val="16"/>
+                <w:sz w:val="18"/>
               </w:rPr>
               <w:t>Goldvorteil*</w:t>
             </w:r>
@@ -309,6 +318,7 @@
         <w:tc>
           <w:tcPr>
             <w:tcW w:type="dxa" w:w="960"/>
+            <w:noWrap/>
           </w:tcPr>
           <w:p>
             <w:pPr>
@@ -316,7 +326,7 @@
             </w:pPr>
             <w:r>
               <w:rPr>
-                <w:sz w:val="16"/>
+                <w:sz w:val="18"/>
               </w:rPr>
               <w:t>2000</w:t>
             </w:r>
@@ -325,6 +335,7 @@
         <w:tc>
           <w:tcPr>
             <w:tcW w:type="dxa" w:w="960"/>
+            <w:noWrap/>
           </w:tcPr>
           <w:p>
             <w:pPr>
@@ -332,7 +343,7 @@
             </w:pPr>
             <w:r>
               <w:rPr>
-                <w:sz w:val="16"/>
+                <w:sz w:val="18"/>
               </w:rPr>
               <w:t>26</w:t>
             </w:r>
@@ -341,6 +352,7 @@
         <w:tc>
           <w:tcPr>
             <w:tcW w:type="dxa" w:w="960"/>
+            <w:noWrap/>
           </w:tcPr>
           <w:p>
             <w:pPr>
@@ -348,7 +360,7 @@
             </w:pPr>
             <w:r>
               <w:rPr>
-                <w:sz w:val="16"/>
+                <w:sz w:val="18"/>
               </w:rPr>
               <w:t>€23,436</w:t>
             </w:r>
@@ -357,6 +369,7 @@
         <w:tc>
           <w:tcPr>
             <w:tcW w:type="dxa" w:w="960"/>
+            <w:noWrap/>
           </w:tcPr>
           <w:p>
             <w:pPr>
@@ -364,7 +377,7 @@
             </w:pPr>
             <w:r>
               <w:rPr>
-                <w:sz w:val="16"/>
+                <w:sz w:val="18"/>
               </w:rPr>
               <w:t>13.2%</w:t>
             </w:r>
@@ -373,6 +386,7 @@
         <w:tc>
           <w:tcPr>
             <w:tcW w:type="dxa" w:w="960"/>
+            <w:noWrap/>
           </w:tcPr>
           <w:p>
             <w:pPr>
@@ -380,7 +394,7 @@
             </w:pPr>
             <w:r>
               <w:rPr>
-                <w:sz w:val="16"/>
+                <w:sz w:val="18"/>
               </w:rPr>
               <w:t>€7,566</w:t>
             </w:r>
@@ -389,6 +403,7 @@
         <w:tc>
           <w:tcPr>
             <w:tcW w:type="dxa" w:w="960"/>
+            <w:noWrap/>
           </w:tcPr>
           <w:p>
             <w:pPr>
@@ -396,7 +411,7 @@
             </w:pPr>
             <w:r>
               <w:rPr>
-                <w:sz w:val="16"/>
+                <w:sz w:val="18"/>
               </w:rPr>
               <w:t>8.2%</w:t>
             </w:r>
@@ -405,6 +420,7 @@
         <w:tc>
           <w:tcPr>
             <w:tcW w:type="dxa" w:w="960"/>
+            <w:noWrap/>
           </w:tcPr>
           <w:p>
             <w:pPr>
@@ -412,7 +428,7 @@
             </w:pPr>
             <w:r>
               <w:rPr>
-                <w:sz w:val="16"/>
+                <w:sz w:val="18"/>
               </w:rPr>
               <w:t>€4,583</w:t>
             </w:r>
@@ -421,6 +437,7 @@
         <w:tc>
           <w:tcPr>
             <w:tcW w:type="dxa" w:w="960"/>
+            <w:noWrap/>
           </w:tcPr>
           <w:p>
             <w:pPr>
@@ -428,7 +445,7 @@
             </w:pPr>
             <w:r>
               <w:rPr>
-                <w:sz w:val="16"/>
+                <w:sz w:val="18"/>
               </w:rPr>
               <w:t>6.1%</w:t>
             </w:r>
@@ -437,6 +454,7 @@
         <w:tc>
           <w:tcPr>
             <w:tcW w:type="dxa" w:w="960"/>
+            <w:noWrap/>
           </w:tcPr>
           <w:p>
             <w:pPr>
@@ -445,7 +463,7 @@
             <w:r>
               <w:rPr>
                 <w:color w:val="008000"/>
-                <w:sz w:val="16"/>
+                <w:sz w:val="18"/>
               </w:rPr>
               <w:t>+€15,869</w:t>
             </w:r>
@@ -456,6 +474,7 @@
         <w:tc>
           <w:tcPr>
             <w:tcW w:type="dxa" w:w="960"/>
+            <w:noWrap/>
           </w:tcPr>
           <w:p>
             <w:pPr>
@@ -463,7 +482,7 @@
             </w:pPr>
             <w:r>
               <w:rPr>
-                <w:sz w:val="16"/>
+                <w:sz w:val="18"/>
               </w:rPr>
               <w:t>2001</w:t>
             </w:r>
@@ -472,6 +491,7 @@
         <w:tc>
           <w:tcPr>
             <w:tcW w:type="dxa" w:w="960"/>
+            <w:noWrap/>
           </w:tcPr>
           <w:p>
             <w:pPr>
@@ -479,7 +499,7 @@
             </w:pPr>
             <w:r>
               <w:rPr>
-                <w:sz w:val="16"/>
+                <w:sz w:val="18"/>
               </w:rPr>
               <w:t>25</w:t>
             </w:r>
@@ -488,6 +508,7 @@
         <w:tc>
           <w:tcPr>
             <w:tcW w:type="dxa" w:w="960"/>
+            <w:noWrap/>
           </w:tcPr>
           <w:p>
             <w:pPr>
@@ -495,7 +516,7 @@
             </w:pPr>
             <w:r>
               <w:rPr>
-                <w:sz w:val="16"/>
+                <w:sz w:val="18"/>
               </w:rPr>
               <w:t>€23,535</w:t>
             </w:r>
@@ -504,6 +525,7 @@
         <w:tc>
           <w:tcPr>
             <w:tcW w:type="dxa" w:w="960"/>
+            <w:noWrap/>
           </w:tcPr>
           <w:p>
             <w:pPr>
@@ -511,7 +533,7 @@
             </w:pPr>
             <w:r>
               <w:rPr>
-                <w:sz w:val="16"/>
+                <w:sz w:val="18"/>
               </w:rPr>
               <w:t>13.4%</w:t>
             </w:r>
@@ -520,6 +542,7 @@
         <w:tc>
           <w:tcPr>
             <w:tcW w:type="dxa" w:w="960"/>
+            <w:noWrap/>
           </w:tcPr>
           <w:p>
             <w:pPr>
@@ -527,7 +550,7 @@
             </w:pPr>
             <w:r>
               <w:rPr>
-                <w:sz w:val="16"/>
+                <w:sz w:val="18"/>
               </w:rPr>
               <w:t>€8,010</w:t>
             </w:r>
@@ -536,6 +559,7 @@
         <w:tc>
           <w:tcPr>
             <w:tcW w:type="dxa" w:w="960"/>
+            <w:noWrap/>
           </w:tcPr>
           <w:p>
             <w:pPr>
@@ -543,7 +567,7 @@
             </w:pPr>
             <w:r>
               <w:rPr>
-                <w:sz w:val="16"/>
+                <w:sz w:val="18"/>
               </w:rPr>
               <w:t>8.6%</w:t>
             </w:r>
@@ -552,6 +576,7 @@
         <w:tc>
           <w:tcPr>
             <w:tcW w:type="dxa" w:w="960"/>
+            <w:noWrap/>
           </w:tcPr>
           <w:p>
             <w:pPr>
@@ -559,7 +584,7 @@
             </w:pPr>
             <w:r>
               <w:rPr>
-                <w:sz w:val="16"/>
+                <w:sz w:val="18"/>
               </w:rPr>
               <w:t>€4,476</w:t>
             </w:r>
@@ -568,6 +593,7 @@
         <w:tc>
           <w:tcPr>
             <w:tcW w:type="dxa" w:w="960"/>
+            <w:noWrap/>
           </w:tcPr>
           <w:p>
             <w:pPr>
@@ -575,7 +601,7 @@
             </w:pPr>
             <w:r>
               <w:rPr>
-                <w:sz w:val="16"/>
+                <w:sz w:val="18"/>
               </w:rPr>
               <w:t>6.1%</w:t>
             </w:r>
@@ -584,6 +610,7 @@
         <w:tc>
           <w:tcPr>
             <w:tcW w:type="dxa" w:w="960"/>
+            <w:noWrap/>
           </w:tcPr>
           <w:p>
             <w:pPr>
@@ -592,7 +619,7 @@
             <w:r>
               <w:rPr>
                 <w:color w:val="008000"/>
-                <w:sz w:val="16"/>
+                <w:sz w:val="18"/>
               </w:rPr>
               <w:t>+€15,525</w:t>
             </w:r>
@@ -603,6 +630,7 @@
         <w:tc>
           <w:tcPr>
             <w:tcW w:type="dxa" w:w="960"/>
+            <w:noWrap/>
           </w:tcPr>
           <w:p>
             <w:pPr>
@@ -610,7 +638,7 @@
             </w:pPr>
             <w:r>
               <w:rPr>
-                <w:sz w:val="16"/>
+                <w:sz w:val="18"/>
               </w:rPr>
               <w:t>2002</w:t>
             </w:r>
@@ -619,6 +647,7 @@
         <w:tc>
           <w:tcPr>
             <w:tcW w:type="dxa" w:w="960"/>
+            <w:noWrap/>
           </w:tcPr>
           <w:p>
             <w:pPr>
@@ -626,7 +655,7 @@
             </w:pPr>
             <w:r>
               <w:rPr>
-                <w:sz w:val="16"/>
+                <w:sz w:val="18"/>
               </w:rPr>
               <w:t>24</w:t>
             </w:r>
@@ -635,6 +664,7 @@
         <w:tc>
           <w:tcPr>
             <w:tcW w:type="dxa" w:w="960"/>
+            <w:noWrap/>
           </w:tcPr>
           <w:p>
             <w:pPr>
@@ -642,7 +672,7 @@
             </w:pPr>
             <w:r>
               <w:rPr>
-                <w:sz w:val="16"/>
+                <w:sz w:val="18"/>
               </w:rPr>
               <w:t>€23,841</w:t>
             </w:r>
@@ -651,6 +681,7 @@
         <w:tc>
           <w:tcPr>
             <w:tcW w:type="dxa" w:w="960"/>
+            <w:noWrap/>
           </w:tcPr>
           <w:p>
             <w:pPr>
@@ -658,7 +689,7 @@
             </w:pPr>
             <w:r>
               <w:rPr>
-                <w:sz w:val="16"/>
+                <w:sz w:val="18"/>
               </w:rPr>
               <w:t>14.1%</w:t>
             </w:r>
@@ -667,6 +698,7 @@
         <w:tc>
           <w:tcPr>
             <w:tcW w:type="dxa" w:w="960"/>
+            <w:noWrap/>
           </w:tcPr>
           <w:p>
             <w:pPr>
@@ -674,7 +706,7 @@
             </w:pPr>
             <w:r>
               <w:rPr>
-                <w:sz w:val="16"/>
+                <w:sz w:val="18"/>
               </w:rPr>
               <w:t>€10,225</w:t>
             </w:r>
@@ -683,6 +715,7 @@
         <w:tc>
           <w:tcPr>
             <w:tcW w:type="dxa" w:w="960"/>
+            <w:noWrap/>
           </w:tcPr>
           <w:p>
             <w:pPr>
@@ -690,7 +723,7 @@
             </w:pPr>
             <w:r>
               <w:rPr>
-                <w:sz w:val="16"/>
+                <w:sz w:val="18"/>
               </w:rPr>
               <w:t>10.1%</w:t>
             </w:r>
@@ -699,6 +732,7 @@
         <w:tc>
           <w:tcPr>
             <w:tcW w:type="dxa" w:w="960"/>
+            <w:noWrap/>
           </w:tcPr>
           <w:p>
             <w:pPr>
@@ -706,7 +740,7 @@
             </w:pPr>
             <w:r>
               <w:rPr>
-                <w:sz w:val="16"/>
+                <w:sz w:val="18"/>
               </w:rPr>
               <w:t>€6,793</w:t>
             </w:r>
@@ -715,6 +749,7 @@
         <w:tc>
           <w:tcPr>
             <w:tcW w:type="dxa" w:w="960"/>
+            <w:noWrap/>
           </w:tcPr>
           <w:p>
             <w:pPr>
@@ -722,7 +757,7 @@
             </w:pPr>
             <w:r>
               <w:rPr>
-                <w:sz w:val="16"/>
+                <w:sz w:val="18"/>
               </w:rPr>
               <w:t>8.3%</w:t>
             </w:r>
@@ -731,6 +766,7 @@
         <w:tc>
           <w:tcPr>
             <w:tcW w:type="dxa" w:w="960"/>
+            <w:noWrap/>
           </w:tcPr>
           <w:p>
             <w:pPr>
@@ -739,7 +775,7 @@
             <w:r>
               <w:rPr>
                 <w:color w:val="008000"/>
-                <w:sz w:val="16"/>
+                <w:sz w:val="18"/>
               </w:rPr>
               <w:t>+€13,615</w:t>
             </w:r>
@@ -750,6 +786,7 @@
         <w:tc>
           <w:tcPr>
             <w:tcW w:type="dxa" w:w="960"/>
+            <w:noWrap/>
           </w:tcPr>
           <w:p>
             <w:pPr>
@@ -757,7 +794,7 @@
             </w:pPr>
             <w:r>
               <w:rPr>
-                <w:sz w:val="16"/>
+                <w:sz w:val="18"/>
               </w:rPr>
               <w:t>2003</w:t>
             </w:r>
@@ -766,6 +803,7 @@
         <w:tc>
           <w:tcPr>
             <w:tcW w:type="dxa" w:w="960"/>
+            <w:noWrap/>
           </w:tcPr>
           <w:p>
             <w:pPr>
@@ -773,7 +811,7 @@
             </w:pPr>
             <w:r>
               <w:rPr>
-                <w:sz w:val="16"/>
+                <w:sz w:val="18"/>
               </w:rPr>
               <w:t>23</w:t>
             </w:r>
@@ -782,6 +820,7 @@
         <w:tc>
           <w:tcPr>
             <w:tcW w:type="dxa" w:w="960"/>
+            <w:noWrap/>
           </w:tcPr>
           <w:p>
             <w:pPr>
@@ -789,7 +828,7 @@
             </w:pPr>
             <w:r>
               <w:rPr>
-                <w:sz w:val="16"/>
+                <w:sz w:val="18"/>
               </w:rPr>
               <w:t>€14,582</w:t>
             </w:r>
@@ -798,6 +837,7 @@
         <w:tc>
           <w:tcPr>
             <w:tcW w:type="dxa" w:w="960"/>
+            <w:noWrap/>
           </w:tcPr>
           <w:p>
             <w:pPr>
@@ -805,7 +845,7 @@
             </w:pPr>
             <w:r>
               <w:rPr>
-                <w:sz w:val="16"/>
+                <w:sz w:val="18"/>
               </w:rPr>
               <w:t>12.3%</w:t>
             </w:r>
@@ -814,6 +854,7 @@
         <w:tc>
           <w:tcPr>
             <w:tcW w:type="dxa" w:w="960"/>
+            <w:noWrap/>
           </w:tcPr>
           <w:p>
             <w:pPr>
@@ -821,7 +862,7 @@
             </w:pPr>
             <w:r>
               <w:rPr>
-                <w:sz w:val="16"/>
+                <w:sz w:val="18"/>
               </w:rPr>
               <w:t>€10,600</w:t>
             </w:r>
@@ -830,6 +871,7 @@
         <w:tc>
           <w:tcPr>
             <w:tcW w:type="dxa" w:w="960"/>
+            <w:noWrap/>
           </w:tcPr>
           <w:p>
             <w:pPr>
@@ -837,7 +879,7 @@
             </w:pPr>
             <w:r>
               <w:rPr>
-                <w:sz w:val="16"/>
+                <w:sz w:val="18"/>
               </w:rPr>
               <w:t>10.8%</w:t>
             </w:r>
@@ -846,6 +888,7 @@
         <w:tc>
           <w:tcPr>
             <w:tcW w:type="dxa" w:w="960"/>
+            <w:noWrap/>
           </w:tcPr>
           <w:p>
             <w:pPr>
@@ -853,7 +896,7 @@
             </w:pPr>
             <w:r>
               <w:rPr>
-                <w:sz w:val="16"/>
+                <w:sz w:val="18"/>
               </w:rPr>
               <w:t>€8,018</w:t>
             </w:r>
@@ -862,6 +905,7 @@
         <w:tc>
           <w:tcPr>
             <w:tcW w:type="dxa" w:w="960"/>
+            <w:noWrap/>
           </w:tcPr>
           <w:p>
             <w:pPr>
@@ -869,7 +913,7 @@
             </w:pPr>
             <w:r>
               <w:rPr>
-                <w:sz w:val="16"/>
+                <w:sz w:val="18"/>
               </w:rPr>
               <w:t>9.4%</w:t>
             </w:r>
@@ -878,6 +922,7 @@
         <w:tc>
           <w:tcPr>
             <w:tcW w:type="dxa" w:w="960"/>
+            <w:noWrap/>
           </w:tcPr>
           <w:p>
             <w:pPr>
@@ -886,7 +931,7 @@
             <w:r>
               <w:rPr>
                 <w:color w:val="008000"/>
-                <w:sz w:val="16"/>
+                <w:sz w:val="18"/>
               </w:rPr>
               <w:t>+€3,982</w:t>
             </w:r>
@@ -897,6 +942,7 @@
         <w:tc>
           <w:tcPr>
             <w:tcW w:type="dxa" w:w="960"/>
+            <w:noWrap/>
           </w:tcPr>
           <w:p>
             <w:pPr>
@@ -904,7 +950,7 @@
             </w:pPr>
             <w:r>
               <w:rPr>
-                <w:sz w:val="16"/>
+                <w:sz w:val="18"/>
               </w:rPr>
               <w:t>2004</w:t>
             </w:r>
@@ -913,6 +959,7 @@
         <w:tc>
           <w:tcPr>
             <w:tcW w:type="dxa" w:w="960"/>
+            <w:noWrap/>
           </w:tcPr>
           <w:p>
             <w:pPr>
@@ -920,7 +967,7 @@
             </w:pPr>
             <w:r>
               <w:rPr>
-                <w:sz w:val="16"/>
+                <w:sz w:val="18"/>
               </w:rPr>
               <w:t>22</w:t>
             </w:r>
@@ -929,6 +976,7 @@
         <w:tc>
           <w:tcPr>
             <w:tcW w:type="dxa" w:w="960"/>
+            <w:noWrap/>
           </w:tcPr>
           <w:p>
             <w:pPr>
@@ -936,7 +984,7 @@
             </w:pPr>
             <w:r>
               <w:rPr>
-                <w:sz w:val="16"/>
+                <w:sz w:val="18"/>
               </w:rPr>
               <w:t>€11,662</w:t>
             </w:r>
@@ -945,6 +993,7 @@
         <w:tc>
           <w:tcPr>
             <w:tcW w:type="dxa" w:w="960"/>
+            <w:noWrap/>
           </w:tcPr>
           <w:p>
             <w:pPr>
@@ -952,7 +1001,7 @@
             </w:pPr>
             <w:r>
               <w:rPr>
-                <w:sz w:val="16"/>
+                <w:sz w:val="18"/>
               </w:rPr>
               <w:t>11.7%</w:t>
             </w:r>
@@ -961,6 +1010,7 @@
         <w:tc>
           <w:tcPr>
             <w:tcW w:type="dxa" w:w="960"/>
+            <w:noWrap/>
           </w:tcPr>
           <w:p>
             <w:pPr>
@@ -968,7 +1018,7 @@
             </w:pPr>
             <w:r>
               <w:rPr>
-                <w:sz w:val="16"/>
+                <w:sz w:val="18"/>
               </w:rPr>
               <w:t>€6,944</w:t>
             </w:r>
@@ -977,6 +1027,7 @@
         <w:tc>
           <w:tcPr>
             <w:tcW w:type="dxa" w:w="960"/>
+            <w:noWrap/>
           </w:tcPr>
           <w:p>
             <w:pPr>
@@ -984,7 +1035,7 @@
             </w:pPr>
             <w:r>
               <w:rPr>
-                <w:sz w:val="16"/>
+                <w:sz w:val="18"/>
               </w:rPr>
               <w:t>9.2%</w:t>
             </w:r>
@@ -993,6 +1044,7 @@
         <w:tc>
           <w:tcPr>
             <w:tcW w:type="dxa" w:w="960"/>
+            <w:noWrap/>
           </w:tcPr>
           <w:p>
             <w:pPr>
@@ -1000,7 +1052,7 @@
             </w:pPr>
             <w:r>
               <w:rPr>
-                <w:sz w:val="16"/>
+                <w:sz w:val="18"/>
               </w:rPr>
               <w:t>€4,230</w:t>
             </w:r>
@@ -1009,6 +1061,7 @@
         <w:tc>
           <w:tcPr>
             <w:tcW w:type="dxa" w:w="960"/>
+            <w:noWrap/>
           </w:tcPr>
           <w:p>
             <w:pPr>
@@ -1016,7 +1069,7 @@
             </w:pPr>
             <w:r>
               <w:rPr>
-                <w:sz w:val="16"/>
+                <w:sz w:val="18"/>
               </w:rPr>
               <w:t>6.7%</w:t>
             </w:r>
@@ -1025,6 +1078,7 @@
         <w:tc>
           <w:tcPr>
             <w:tcW w:type="dxa" w:w="960"/>
+            <w:noWrap/>
           </w:tcPr>
           <w:p>
             <w:pPr>
@@ -1033,7 +1087,7 @@
             <w:r>
               <w:rPr>
                 <w:color w:val="008000"/>
-                <w:sz w:val="16"/>
+                <w:sz w:val="18"/>
               </w:rPr>
               <w:t>+€4,718</w:t>
             </w:r>
@@ -1044,6 +1098,7 @@
         <w:tc>
           <w:tcPr>
             <w:tcW w:type="dxa" w:w="960"/>
+            <w:noWrap/>
           </w:tcPr>
           <w:p>
             <w:pPr>
@@ -1051,7 +1106,7 @@
             </w:pPr>
             <w:r>
               <w:rPr>
-                <w:sz w:val="16"/>
+                <w:sz w:val="18"/>
               </w:rPr>
               <w:t>2005</w:t>
             </w:r>
@@ -1060,6 +1115,7 @@
         <w:tc>
           <w:tcPr>
             <w:tcW w:type="dxa" w:w="960"/>
+            <w:noWrap/>
           </w:tcPr>
           <w:p>
             <w:pPr>
@@ -1067,7 +1123,7 @@
             </w:pPr>
             <w:r>
               <w:rPr>
-                <w:sz w:val="16"/>
+                <w:sz w:val="18"/>
               </w:rPr>
               <w:t>21</w:t>
             </w:r>
@@ -1076,6 +1132,7 @@
         <w:tc>
           <w:tcPr>
             <w:tcW w:type="dxa" w:w="960"/>
+            <w:noWrap/>
           </w:tcPr>
           <w:p>
             <w:pPr>
@@ -1083,7 +1140,7 @@
             </w:pPr>
             <w:r>
               <w:rPr>
-                <w:sz w:val="16"/>
+                <w:sz w:val="18"/>
               </w:rPr>
               <w:t>€10,565</w:t>
             </w:r>
@@ -1092,6 +1149,7 @@
         <w:tc>
           <w:tcPr>
             <w:tcW w:type="dxa" w:w="960"/>
+            <w:noWrap/>
           </w:tcPr>
           <w:p>
             <w:pPr>
@@ -1099,7 +1157,7 @@
             </w:pPr>
             <w:r>
               <w:rPr>
-                <w:sz w:val="16"/>
+                <w:sz w:val="18"/>
               </w:rPr>
               <w:t>11.8%</w:t>
             </w:r>
@@ -1108,6 +1166,7 @@
         <w:tc>
           <w:tcPr>
             <w:tcW w:type="dxa" w:w="960"/>
+            <w:noWrap/>
           </w:tcPr>
           <w:p>
             <w:pPr>
@@ -1115,7 +1174,7 @@
             </w:pPr>
             <w:r>
               <w:rPr>
-                <w:sz w:val="16"/>
+                <w:sz w:val="18"/>
               </w:rPr>
               <w:t>€6,230</w:t>
             </w:r>
@@ -1124,6 +1183,7 @@
         <w:tc>
           <w:tcPr>
             <w:tcW w:type="dxa" w:w="960"/>
+            <w:noWrap/>
           </w:tcPr>
           <w:p>
             <w:pPr>
@@ -1131,7 +1191,7 @@
             </w:pPr>
             <w:r>
               <w:rPr>
-                <w:sz w:val="16"/>
+                <w:sz w:val="18"/>
               </w:rPr>
               <w:t>9.1%</w:t>
             </w:r>
@@ -1140,6 +1200,7 @@
         <w:tc>
           <w:tcPr>
             <w:tcW w:type="dxa" w:w="960"/>
+            <w:noWrap/>
           </w:tcPr>
           <w:p>
             <w:pPr>
@@ -1147,7 +1208,7 @@
             </w:pPr>
             <w:r>
               <w:rPr>
-                <w:sz w:val="16"/>
+                <w:sz w:val="18"/>
               </w:rPr>
               <w:t>€3,668</w:t>
             </w:r>
@@ -1156,6 +1217,7 @@
         <w:tc>
           <w:tcPr>
             <w:tcW w:type="dxa" w:w="960"/>
+            <w:noWrap/>
           </w:tcPr>
           <w:p>
             <w:pPr>
@@ -1163,7 +1225,7 @@
             </w:pPr>
             <w:r>
               <w:rPr>
-                <w:sz w:val="16"/>
+                <w:sz w:val="18"/>
               </w:rPr>
               <w:t>6.3%</w:t>
             </w:r>
@@ -1172,6 +1234,7 @@
         <w:tc>
           <w:tcPr>
             <w:tcW w:type="dxa" w:w="960"/>
+            <w:noWrap/>
           </w:tcPr>
           <w:p>
             <w:pPr>
@@ -1180,7 +1243,7 @@
             <w:r>
               <w:rPr>
                 <w:color w:val="008000"/>
-                <w:sz w:val="16"/>
+                <w:sz w:val="18"/>
               </w:rPr>
               <w:t>+€4,335</w:t>
             </w:r>
@@ -1191,6 +1254,7 @@
         <w:tc>
           <w:tcPr>
             <w:tcW w:type="dxa" w:w="960"/>
+            <w:noWrap/>
           </w:tcPr>
           <w:p>
             <w:pPr>
@@ -1198,7 +1262,7 @@
             </w:pPr>
             <w:r>
               <w:rPr>
-                <w:sz w:val="16"/>
+                <w:sz w:val="18"/>
               </w:rPr>
               <w:t>2006</w:t>
             </w:r>
@@ -1207,6 +1271,7 @@
         <w:tc>
           <w:tcPr>
             <w:tcW w:type="dxa" w:w="960"/>
+            <w:noWrap/>
           </w:tcPr>
           <w:p>
             <w:pPr>
@@ -1214,7 +1279,7 @@
             </w:pPr>
             <w:r>
               <w:rPr>
-                <w:sz w:val="16"/>
+                <w:sz w:val="18"/>
               </w:rPr>
               <w:t>20</w:t>
             </w:r>
@@ -1223,6 +1288,7 @@
         <w:tc>
           <w:tcPr>
             <w:tcW w:type="dxa" w:w="960"/>
+            <w:noWrap/>
           </w:tcPr>
           <w:p>
             <w:pPr>
@@ -1230,7 +1296,7 @@
             </w:pPr>
             <w:r>
               <w:rPr>
-                <w:sz w:val="16"/>
+                <w:sz w:val="18"/>
               </w:rPr>
               <w:t>€8,398</w:t>
             </w:r>
@@ -1239,6 +1305,7 @@
         <w:tc>
           <w:tcPr>
             <w:tcW w:type="dxa" w:w="960"/>
+            <w:noWrap/>
           </w:tcPr>
           <w:p>
             <w:pPr>
@@ -1246,7 +1313,7 @@
             </w:pPr>
             <w:r>
               <w:rPr>
-                <w:sz w:val="16"/>
+                <w:sz w:val="18"/>
               </w:rPr>
               <w:t>11.2%</w:t>
             </w:r>
@@ -1255,6 +1322,7 @@
         <w:tc>
           <w:tcPr>
             <w:tcW w:type="dxa" w:w="960"/>
+            <w:noWrap/>
           </w:tcPr>
           <w:p>
             <w:pPr>
@@ -1262,7 +1330,7 @@
             </w:pPr>
             <w:r>
               <w:rPr>
-                <w:sz w:val="16"/>
+                <w:sz w:val="18"/>
               </w:rPr>
               <w:t>€6,076</w:t>
             </w:r>
@@ -1271,6 +1339,7 @@
         <w:tc>
           <w:tcPr>
             <w:tcW w:type="dxa" w:w="960"/>
+            <w:noWrap/>
           </w:tcPr>
           <w:p>
             <w:pPr>
@@ -1278,7 +1347,7 @@
             </w:pPr>
             <w:r>
               <w:rPr>
-                <w:sz w:val="16"/>
+                <w:sz w:val="18"/>
               </w:rPr>
               <w:t>9.4%</w:t>
             </w:r>
@@ -1287,6 +1356,7 @@
         <w:tc>
           <w:tcPr>
             <w:tcW w:type="dxa" w:w="960"/>
+            <w:noWrap/>
           </w:tcPr>
           <w:p>
             <w:pPr>
@@ -1294,7 +1364,7 @@
             </w:pPr>
             <w:r>
               <w:rPr>
-                <w:sz w:val="16"/>
+                <w:sz w:val="18"/>
               </w:rPr>
               <w:t>€3,207</w:t>
             </w:r>
@@ -1303,6 +1373,7 @@
         <w:tc>
           <w:tcPr>
             <w:tcW w:type="dxa" w:w="960"/>
+            <w:noWrap/>
           </w:tcPr>
           <w:p>
             <w:pPr>
@@ -1310,7 +1381,7 @@
             </w:pPr>
             <w:r>
               <w:rPr>
-                <w:sz w:val="16"/>
+                <w:sz w:val="18"/>
               </w:rPr>
               <w:t>6.0%</w:t>
             </w:r>
@@ -1319,6 +1390,7 @@
         <w:tc>
           <w:tcPr>
             <w:tcW w:type="dxa" w:w="960"/>
+            <w:noWrap/>
           </w:tcPr>
           <w:p>
             <w:pPr>
@@ -1327,7 +1399,7 @@
             <w:r>
               <w:rPr>
                 <w:color w:val="008000"/>
-                <w:sz w:val="16"/>
+                <w:sz w:val="18"/>
               </w:rPr>
               <w:t>+€2,322</w:t>
             </w:r>
@@ -1338,6 +1410,7 @@
         <w:tc>
           <w:tcPr>
             <w:tcW w:type="dxa" w:w="960"/>
+            <w:noWrap/>
           </w:tcPr>
           <w:p>
             <w:pPr>
@@ -1345,7 +1418,7 @@
             </w:pPr>
             <w:r>
               <w:rPr>
-                <w:sz w:val="16"/>
+                <w:sz w:val="18"/>
               </w:rPr>
               <w:t>2007</w:t>
             </w:r>
@@ -1354,6 +1427,7 @@
         <w:tc>
           <w:tcPr>
             <w:tcW w:type="dxa" w:w="960"/>
+            <w:noWrap/>
           </w:tcPr>
           <w:p>
             <w:pPr>
@@ -1361,7 +1435,7 @@
             </w:pPr>
             <w:r>
               <w:rPr>
-                <w:sz w:val="16"/>
+                <w:sz w:val="18"/>
               </w:rPr>
               <w:t>19</w:t>
             </w:r>
@@ -1370,6 +1444,7 @@
         <w:tc>
           <w:tcPr>
             <w:tcW w:type="dxa" w:w="960"/>
+            <w:noWrap/>
           </w:tcPr>
           <w:p>
             <w:pPr>
@@ -1377,7 +1452,7 @@
             </w:pPr>
             <w:r>
               <w:rPr>
-                <w:sz w:val="16"/>
+                <w:sz w:val="18"/>
               </w:rPr>
               <w:t>€6,878</w:t>
             </w:r>
@@ -1386,6 +1461,7 @@
         <w:tc>
           <w:tcPr>
             <w:tcW w:type="dxa" w:w="960"/>
+            <w:noWrap/>
           </w:tcPr>
           <w:p>
             <w:pPr>
@@ -1393,7 +1469,7 @@
             </w:pPr>
             <w:r>
               <w:rPr>
-                <w:sz w:val="16"/>
+                <w:sz w:val="18"/>
               </w:rPr>
               <w:t>10.6%</w:t>
             </w:r>
@@ -1402,6 +1478,7 @@
         <w:tc>
           <w:tcPr>
             <w:tcW w:type="dxa" w:w="960"/>
+            <w:noWrap/>
           </w:tcPr>
           <w:p>
             <w:pPr>
@@ -1409,7 +1486,7 @@
             </w:pPr>
             <w:r>
               <w:rPr>
-                <w:sz w:val="16"/>
+                <w:sz w:val="18"/>
               </w:rPr>
               <w:t>€4,997</w:t>
             </w:r>
@@ -1418,6 +1495,7 @@
         <w:tc>
           <w:tcPr>
             <w:tcW w:type="dxa" w:w="960"/>
+            <w:noWrap/>
           </w:tcPr>
           <w:p>
             <w:pPr>
@@ -1425,7 +1503,7 @@
             </w:pPr>
             <w:r>
               <w:rPr>
-                <w:sz w:val="16"/>
+                <w:sz w:val="18"/>
               </w:rPr>
               <w:t>8.8%</w:t>
             </w:r>
@@ -1434,6 +1512,7 @@
         <w:tc>
           <w:tcPr>
             <w:tcW w:type="dxa" w:w="960"/>
+            <w:noWrap/>
           </w:tcPr>
           <w:p>
             <w:pPr>
@@ -1441,7 +1520,7 @@
             </w:pPr>
             <w:r>
               <w:rPr>
-                <w:sz w:val="16"/>
+                <w:sz w:val="18"/>
               </w:rPr>
               <w:t>€2,395</w:t>
             </w:r>
@@ -1450,6 +1529,7 @@
         <w:tc>
           <w:tcPr>
             <w:tcW w:type="dxa" w:w="960"/>
+            <w:noWrap/>
           </w:tcPr>
           <w:p>
             <w:pPr>
@@ -1457,7 +1537,7 @@
             </w:pPr>
             <w:r>
               <w:rPr>
-                <w:sz w:val="16"/>
+                <w:sz w:val="18"/>
               </w:rPr>
               <w:t>4.7%</w:t>
             </w:r>
@@ -1466,6 +1546,7 @@
         <w:tc>
           <w:tcPr>
             <w:tcW w:type="dxa" w:w="960"/>
+            <w:noWrap/>
           </w:tcPr>
           <w:p>
             <w:pPr>
@@ -1474,7 +1555,7 @@
             <w:r>
               <w:rPr>
                 <w:color w:val="008000"/>
-                <w:sz w:val="16"/>
+                <w:sz w:val="18"/>
               </w:rPr>
               <w:t>+€1,880</w:t>
             </w:r>
@@ -1485,6 +1566,7 @@
         <w:tc>
           <w:tcPr>
             <w:tcW w:type="dxa" w:w="960"/>
+            <w:noWrap/>
           </w:tcPr>
           <w:p>
             <w:pPr>
@@ -1493,7 +1575,7 @@
             <w:r>
               <w:rPr>
                 <w:color w:val="CC0000"/>
-                <w:sz w:val="16"/>
+                <w:sz w:val="18"/>
               </w:rPr>
               <w:t>2008</w:t>
             </w:r>
@@ -1502,6 +1584,7 @@
         <w:tc>
           <w:tcPr>
             <w:tcW w:type="dxa" w:w="960"/>
+            <w:noWrap/>
           </w:tcPr>
           <w:p>
             <w:pPr>
@@ -1510,7 +1593,7 @@
             <w:r>
               <w:rPr>
                 <w:color w:val="CC0000"/>
-                <w:sz w:val="16"/>
+                <w:sz w:val="18"/>
               </w:rPr>
               <w:t>18</w:t>
             </w:r>
@@ -1519,6 +1602,7 @@
         <w:tc>
           <w:tcPr>
             <w:tcW w:type="dxa" w:w="960"/>
+            <w:noWrap/>
           </w:tcPr>
           <w:p>
             <w:pPr>
@@ -1527,7 +1611,7 @@
             <w:r>
               <w:rPr>
                 <w:color w:val="CC0000"/>
-                <w:sz w:val="16"/>
+                <w:sz w:val="18"/>
               </w:rPr>
               <w:t>€4,234</w:t>
             </w:r>
@@ -1536,6 +1620,7 @@
         <w:tc>
           <w:tcPr>
             <w:tcW w:type="dxa" w:w="960"/>
+            <w:noWrap/>
           </w:tcPr>
           <w:p>
             <w:pPr>
@@ -1544,7 +1629,7 @@
             <w:r>
               <w:rPr>
                 <w:color w:val="CC0000"/>
-                <w:sz w:val="16"/>
+                <w:sz w:val="18"/>
               </w:rPr>
               <w:t>8.3%</w:t>
             </w:r>
@@ -1553,6 +1638,7 @@
         <w:tc>
           <w:tcPr>
             <w:tcW w:type="dxa" w:w="960"/>
+            <w:noWrap/>
           </w:tcPr>
           <w:p>
             <w:pPr>
@@ -1561,7 +1647,7 @@
             <w:r>
               <w:rPr>
                 <w:color w:val="CC0000"/>
-                <w:sz w:val="16"/>
+                <w:sz w:val="18"/>
               </w:rPr>
               <w:t>€4,476</w:t>
             </w:r>
@@ -1570,6 +1656,7 @@
         <w:tc>
           <w:tcPr>
             <w:tcW w:type="dxa" w:w="960"/>
+            <w:noWrap/>
           </w:tcPr>
           <w:p>
             <w:pPr>
@@ -1578,7 +1665,7 @@
             <w:r>
               <w:rPr>
                 <w:color w:val="CC0000"/>
-                <w:sz w:val="16"/>
+                <w:sz w:val="18"/>
               </w:rPr>
               <w:t>8.6%</w:t>
             </w:r>
@@ -1587,6 +1674,7 @@
         <w:tc>
           <w:tcPr>
             <w:tcW w:type="dxa" w:w="960"/>
+            <w:noWrap/>
           </w:tcPr>
           <w:p>
             <w:pPr>
@@ -1595,7 +1683,7 @@
             <w:r>
               <w:rPr>
                 <w:color w:val="CC0000"/>
-                <w:sz w:val="16"/>
+                <w:sz w:val="18"/>
               </w:rPr>
               <w:t>€1,847</w:t>
             </w:r>
@@ -1604,6 +1692,7 @@
         <w:tc>
           <w:tcPr>
             <w:tcW w:type="dxa" w:w="960"/>
+            <w:noWrap/>
           </w:tcPr>
           <w:p>
             <w:pPr>
@@ -1612,7 +1701,7 @@
             <w:r>
               <w:rPr>
                 <w:color w:val="CC0000"/>
-                <w:sz w:val="16"/>
+                <w:sz w:val="18"/>
               </w:rPr>
               <w:t>3.4%</w:t>
             </w:r>
@@ -1621,6 +1710,7 @@
         <w:tc>
           <w:tcPr>
             <w:tcW w:type="dxa" w:w="960"/>
+            <w:noWrap/>
           </w:tcPr>
           <w:p>
             <w:pPr>
@@ -1629,7 +1719,7 @@
             <w:r>
               <w:rPr>
                 <w:color w:val="CC0000"/>
-                <w:sz w:val="16"/>
+                <w:sz w:val="18"/>
               </w:rPr>
               <w:t>€-243</w:t>
             </w:r>
@@ -1640,6 +1730,7 @@
         <w:tc>
           <w:tcPr>
             <w:tcW w:type="dxa" w:w="960"/>
+            <w:noWrap/>
           </w:tcPr>
           <w:p>
             <w:pPr>
@@ -1648,7 +1739,7 @@
             <w:r>
               <w:rPr>
                 <w:color w:val="CC0000"/>
-                <w:sz w:val="16"/>
+                <w:sz w:val="18"/>
               </w:rPr>
               <w:t>2009</w:t>
             </w:r>
@@ -1657,6 +1748,7 @@
         <w:tc>
           <w:tcPr>
             <w:tcW w:type="dxa" w:w="960"/>
+            <w:noWrap/>
           </w:tcPr>
           <w:p>
             <w:pPr>
@@ -1665,7 +1757,7 @@
             <w:r>
               <w:rPr>
                 <w:color w:val="CC0000"/>
-                <w:sz w:val="16"/>
+                <w:sz w:val="18"/>
               </w:rPr>
               <w:t>17</w:t>
             </w:r>
@@ -1674,6 +1766,7 @@
         <w:tc>
           <w:tcPr>
             <w:tcW w:type="dxa" w:w="960"/>
+            <w:noWrap/>
           </w:tcPr>
           <w:p>
             <w:pPr>
@@ -1682,7 +1775,7 @@
             <w:r>
               <w:rPr>
                 <w:color w:val="CC0000"/>
-                <w:sz w:val="16"/>
+                <w:sz w:val="18"/>
               </w:rPr>
               <w:t>€4,888</w:t>
             </w:r>
@@ -1691,6 +1784,7 @@
         <w:tc>
           <w:tcPr>
             <w:tcW w:type="dxa" w:w="960"/>
+            <w:noWrap/>
           </w:tcPr>
           <w:p>
             <w:pPr>
@@ -1699,7 +1793,7 @@
             <w:r>
               <w:rPr>
                 <w:color w:val="CC0000"/>
-                <w:sz w:val="16"/>
+                <w:sz w:val="18"/>
               </w:rPr>
               <w:t>9.7%</w:t>
             </w:r>
@@ -1708,6 +1802,7 @@
         <w:tc>
           <w:tcPr>
             <w:tcW w:type="dxa" w:w="960"/>
+            <w:noWrap/>
           </w:tcPr>
           <w:p>
             <w:pPr>
@@ -1716,7 +1811,7 @@
             <w:r>
               <w:rPr>
                 <w:color w:val="CC0000"/>
-                <w:sz w:val="16"/>
+                <w:sz w:val="18"/>
               </w:rPr>
               <w:t>€8,298</w:t>
             </w:r>
@@ -1725,6 +1820,7 @@
         <w:tc>
           <w:tcPr>
             <w:tcW w:type="dxa" w:w="960"/>
+            <w:noWrap/>
           </w:tcPr>
           <w:p>
             <w:pPr>
@@ -1733,7 +1829,7 @@
             <w:r>
               <w:rPr>
                 <w:color w:val="CC0000"/>
-                <w:sz w:val="16"/>
+                <w:sz w:val="18"/>
               </w:rPr>
               <w:t>13.2%</w:t>
             </w:r>
@@ -1742,6 +1838,7 @@
         <w:tc>
           <w:tcPr>
             <w:tcW w:type="dxa" w:w="960"/>
+            <w:noWrap/>
           </w:tcPr>
           <w:p>
             <w:pPr>
@@ -1750,7 +1847,7 @@
             <w:r>
               <w:rPr>
                 <w:color w:val="CC0000"/>
-                <w:sz w:val="16"/>
+                <w:sz w:val="18"/>
               </w:rPr>
               <w:t>€3,718</w:t>
             </w:r>
@@ -1759,6 +1856,7 @@
         <w:tc>
           <w:tcPr>
             <w:tcW w:type="dxa" w:w="960"/>
+            <w:noWrap/>
           </w:tcPr>
           <w:p>
             <w:pPr>
@@ -1767,7 +1865,7 @@
             <w:r>
               <w:rPr>
                 <w:color w:val="CC0000"/>
-                <w:sz w:val="16"/>
+                <w:sz w:val="18"/>
               </w:rPr>
               <w:t>8.0%</w:t>
             </w:r>
@@ -1776,6 +1874,7 @@
         <w:tc>
           <w:tcPr>
             <w:tcW w:type="dxa" w:w="960"/>
+            <w:noWrap/>
           </w:tcPr>
           <w:p>
             <w:pPr>
@@ -1784,7 +1883,7 @@
             <w:r>
               <w:rPr>
                 <w:color w:val="CC0000"/>
-                <w:sz w:val="16"/>
+                <w:sz w:val="18"/>
               </w:rPr>
               <w:t>€-3,410</w:t>
             </w:r>
@@ -1795,6 +1894,7 @@
         <w:tc>
           <w:tcPr>
             <w:tcW w:type="dxa" w:w="960"/>
+            <w:noWrap/>
           </w:tcPr>
           <w:p>
             <w:pPr>
@@ -1803,7 +1903,7 @@
             <w:r>
               <w:rPr>
                 <w:color w:val="CC0000"/>
-                <w:sz w:val="16"/>
+                <w:sz w:val="18"/>
               </w:rPr>
               <w:t>2010</w:t>
             </w:r>
@@ -1812,6 +1912,7 @@
         <w:tc>
           <w:tcPr>
             <w:tcW w:type="dxa" w:w="960"/>
+            <w:noWrap/>
           </w:tcPr>
           <w:p>
             <w:pPr>
@@ -1820,7 +1921,7 @@
             <w:r>
               <w:rPr>
                 <w:color w:val="CC0000"/>
-                <w:sz w:val="16"/>
+                <w:sz w:val="18"/>
               </w:rPr>
               <w:t>16</w:t>
             </w:r>
@@ -1829,6 +1930,7 @@
         <w:tc>
           <w:tcPr>
             <w:tcW w:type="dxa" w:w="960"/>
+            <w:noWrap/>
           </w:tcPr>
           <w:p>
             <w:pPr>
@@ -1837,7 +1939,7 @@
             <w:r>
               <w:rPr>
                 <w:color w:val="CC0000"/>
-                <w:sz w:val="16"/>
+                <w:sz w:val="18"/>
               </w:rPr>
               <w:t>€3,840</w:t>
             </w:r>
@@ -1846,6 +1948,7 @@
         <w:tc>
           <w:tcPr>
             <w:tcW w:type="dxa" w:w="960"/>
+            <w:noWrap/>
           </w:tcPr>
           <w:p>
             <w:pPr>
@@ -1854,7 +1957,7 @@
             <w:r>
               <w:rPr>
                 <w:color w:val="CC0000"/>
-                <w:sz w:val="16"/>
+                <w:sz w:val="18"/>
               </w:rPr>
               <w:t>8.7%</w:t>
             </w:r>
@@ -1863,6 +1966,7 @@
         <w:tc>
           <w:tcPr>
             <w:tcW w:type="dxa" w:w="960"/>
+            <w:noWrap/>
           </w:tcPr>
           <w:p>
             <w:pPr>
@@ -1871,7 +1975,7 @@
             <w:r>
               <w:rPr>
                 <w:color w:val="CC0000"/>
-                <w:sz w:val="16"/>
+                <w:sz w:val="18"/>
               </w:rPr>
               <w:t>€5,777</w:t>
             </w:r>
@@ -1880,6 +1984,7 @@
         <w:tc>
           <w:tcPr>
             <w:tcW w:type="dxa" w:w="960"/>
+            <w:noWrap/>
           </w:tcPr>
           <w:p>
             <w:pPr>
@@ -1888,7 +1993,7 @@
             <w:r>
               <w:rPr>
                 <w:color w:val="CC0000"/>
-                <w:sz w:val="16"/>
+                <w:sz w:val="18"/>
               </w:rPr>
               <w:t>11.5%</w:t>
             </w:r>
@@ -1897,6 +2002,7 @@
         <w:tc>
           <w:tcPr>
             <w:tcW w:type="dxa" w:w="960"/>
+            <w:noWrap/>
           </w:tcPr>
           <w:p>
             <w:pPr>
@@ -1905,7 +2011,7 @@
             <w:r>
               <w:rPr>
                 <w:color w:val="CC0000"/>
-                <w:sz w:val="16"/>
+                <w:sz w:val="18"/>
               </w:rPr>
               <w:t>€2,486</w:t>
             </w:r>
@@ -1914,6 +2020,7 @@
         <w:tc>
           <w:tcPr>
             <w:tcW w:type="dxa" w:w="960"/>
+            <w:noWrap/>
           </w:tcPr>
           <w:p>
             <w:pPr>
@@ -1922,7 +2029,7 @@
             <w:r>
               <w:rPr>
                 <w:color w:val="CC0000"/>
-                <w:sz w:val="16"/>
+                <w:sz w:val="18"/>
               </w:rPr>
               <w:t>5.8%</w:t>
             </w:r>
@@ -1931,6 +2038,7 @@
         <w:tc>
           <w:tcPr>
             <w:tcW w:type="dxa" w:w="960"/>
+            <w:noWrap/>
           </w:tcPr>
           <w:p>
             <w:pPr>
@@ -1939,7 +2047,7 @@
             <w:r>
               <w:rPr>
                 <w:color w:val="CC0000"/>
-                <w:sz w:val="16"/>
+                <w:sz w:val="18"/>
               </w:rPr>
               <w:t>€-1,936</w:t>
             </w:r>
@@ -1950,6 +2058,7 @@
         <w:tc>
           <w:tcPr>
             <w:tcW w:type="dxa" w:w="960"/>
+            <w:noWrap/>
           </w:tcPr>
           <w:p>
             <w:pPr>
@@ -1958,7 +2067,7 @@
             <w:r>
               <w:rPr>
                 <w:color w:val="CC0000"/>
-                <w:sz w:val="16"/>
+                <w:sz w:val="18"/>
               </w:rPr>
               <w:t>2011</w:t>
             </w:r>
@@ -1967,6 +2076,7 @@
         <w:tc>
           <w:tcPr>
             <w:tcW w:type="dxa" w:w="960"/>
+            <w:noWrap/>
           </w:tcPr>
           <w:p>
             <w:pPr>
@@ -1975,7 +2085,7 @@
             <w:r>
               <w:rPr>
                 <w:color w:val="CC0000"/>
-                <w:sz w:val="16"/>
+                <w:sz w:val="18"/>
               </w:rPr>
               <w:t>15</w:t>
             </w:r>
@@ -1984,6 +2094,7 @@
         <w:tc>
           <w:tcPr>
             <w:tcW w:type="dxa" w:w="960"/>
+            <w:noWrap/>
           </w:tcPr>
           <w:p>
             <w:pPr>
@@ -1992,7 +2103,7 @@
             <w:r>
               <w:rPr>
                 <w:color w:val="CC0000"/>
-                <w:sz w:val="16"/>
+                <w:sz w:val="18"/>
               </w:rPr>
               <w:t>€3,181</w:t>
             </w:r>
@@ -2001,6 +2112,7 @@
         <w:tc>
           <w:tcPr>
             <w:tcW w:type="dxa" w:w="960"/>
+            <w:noWrap/>
           </w:tcPr>
           <w:p>
             <w:pPr>
@@ -2009,7 +2121,7 @@
             <w:r>
               <w:rPr>
                 <w:color w:val="CC0000"/>
-                <w:sz w:val="16"/>
+                <w:sz w:val="18"/>
               </w:rPr>
               <w:t>8.0%</w:t>
             </w:r>
@@ -2018,6 +2130,7 @@
         <w:tc>
           <w:tcPr>
             <w:tcW w:type="dxa" w:w="960"/>
+            <w:noWrap/>
           </w:tcPr>
           <w:p>
             <w:pPr>
@@ -2026,7 +2139,7 @@
             <w:r>
               <w:rPr>
                 <w:color w:val="CC0000"/>
-                <w:sz w:val="16"/>
+                <w:sz w:val="18"/>
               </w:rPr>
               <w:t>€4,853</w:t>
             </w:r>
@@ -2035,6 +2148,7 @@
         <w:tc>
           <w:tcPr>
             <w:tcW w:type="dxa" w:w="960"/>
+            <w:noWrap/>
           </w:tcPr>
           <w:p>
             <w:pPr>
@@ -2043,7 +2157,7 @@
             <w:r>
               <w:rPr>
                 <w:color w:val="CC0000"/>
-                <w:sz w:val="16"/>
+                <w:sz w:val="18"/>
               </w:rPr>
               <w:t>11.0%</w:t>
             </w:r>
@@ -2052,6 +2166,7 @@
         <w:tc>
           <w:tcPr>
             <w:tcW w:type="dxa" w:w="960"/>
+            <w:noWrap/>
           </w:tcPr>
           <w:p>
             <w:pPr>
@@ -2060,7 +2175,7 @@
             <w:r>
               <w:rPr>
                 <w:color w:val="CC0000"/>
-                <w:sz w:val="16"/>
+                <w:sz w:val="18"/>
               </w:rPr>
               <w:t>€2,082</w:t>
             </w:r>
@@ -2069,6 +2184,7 @@
         <w:tc>
           <w:tcPr>
             <w:tcW w:type="dxa" w:w="960"/>
+            <w:noWrap/>
           </w:tcPr>
           <w:p>
             <w:pPr>
@@ -2077,7 +2193,7 @@
             <w:r>
               <w:rPr>
                 <w:color w:val="CC0000"/>
-                <w:sz w:val="16"/>
+                <w:sz w:val="18"/>
               </w:rPr>
               <w:t>5.0%</w:t>
             </w:r>
@@ -2086,6 +2202,7 @@
         <w:tc>
           <w:tcPr>
             <w:tcW w:type="dxa" w:w="960"/>
+            <w:noWrap/>
           </w:tcPr>
           <w:p>
             <w:pPr>
@@ -2094,7 +2211,7 @@
             <w:r>
               <w:rPr>
                 <w:color w:val="CC0000"/>
-                <w:sz w:val="16"/>
+                <w:sz w:val="18"/>
               </w:rPr>
               <w:t>€-1,672</w:t>
             </w:r>
@@ -2105,6 +2222,7 @@
         <w:tc>
           <w:tcPr>
             <w:tcW w:type="dxa" w:w="960"/>
+            <w:noWrap/>
           </w:tcPr>
           <w:p>
             <w:pPr>
@@ -2113,7 +2231,7 @@
             <w:r>
               <w:rPr>
                 <w:color w:val="CC0000"/>
-                <w:sz w:val="16"/>
+                <w:sz w:val="18"/>
               </w:rPr>
               <w:t>2012</w:t>
             </w:r>
@@ -2122,6 +2240,7 @@
         <w:tc>
           <w:tcPr>
             <w:tcW w:type="dxa" w:w="960"/>
+            <w:noWrap/>
           </w:tcPr>
           <w:p>
             <w:pPr>
@@ -2130,7 +2249,7 @@
             <w:r>
               <w:rPr>
                 <w:color w:val="CC0000"/>
-                <w:sz w:val="16"/>
+                <w:sz w:val="18"/>
               </w:rPr>
               <w:t>14</w:t>
             </w:r>
@@ -2139,6 +2258,7 @@
         <w:tc>
           <w:tcPr>
             <w:tcW w:type="dxa" w:w="960"/>
+            <w:noWrap/>
           </w:tcPr>
           <w:p>
             <w:pPr>
@@ -2147,7 +2267,7 @@
             <w:r>
               <w:rPr>
                 <w:color w:val="CC0000"/>
-                <w:sz w:val="16"/>
+                <w:sz w:val="18"/>
               </w:rPr>
               <w:t>€2,537</w:t>
             </w:r>
@@ -2156,6 +2276,7 @@
         <w:tc>
           <w:tcPr>
             <w:tcW w:type="dxa" w:w="960"/>
+            <w:noWrap/>
           </w:tcPr>
           <w:p>
             <w:pPr>
@@ -2164,7 +2285,7 @@
             <w:r>
               <w:rPr>
                 <w:color w:val="CC0000"/>
-                <w:sz w:val="16"/>
+                <w:sz w:val="18"/>
               </w:rPr>
               <w:t>6.8%</w:t>
             </w:r>
@@ -2173,6 +2294,7 @@
         <w:tc>
           <w:tcPr>
             <w:tcW w:type="dxa" w:w="960"/>
+            <w:noWrap/>
           </w:tcPr>
           <w:p>
             <w:pPr>
@@ -2181,7 +2303,7 @@
             <w:r>
               <w:rPr>
                 <w:color w:val="CC0000"/>
-                <w:sz w:val="16"/>
+                <w:sz w:val="18"/>
               </w:rPr>
               <w:t>€4,840</w:t>
             </w:r>
@@ -2190,6 +2312,7 @@
         <w:tc>
           <w:tcPr>
             <w:tcW w:type="dxa" w:w="960"/>
+            <w:noWrap/>
           </w:tcPr>
           <w:p>
             <w:pPr>
@@ -2198,7 +2321,7 @@
             <w:r>
               <w:rPr>
                 <w:color w:val="CC0000"/>
-                <w:sz w:val="16"/>
+                <w:sz w:val="18"/>
               </w:rPr>
               <w:t>11.8%</w:t>
             </w:r>
@@ -2207,6 +2330,7 @@
         <w:tc>
           <w:tcPr>
             <w:tcW w:type="dxa" w:w="960"/>
+            <w:noWrap/>
           </w:tcPr>
           <w:p>
             <w:pPr>
@@ -2215,7 +2339,7 @@
             <w:r>
               <w:rPr>
                 <w:color w:val="CC0000"/>
-                <w:sz w:val="16"/>
+                <w:sz w:val="18"/>
               </w:rPr>
               <w:t>€2,430</w:t>
             </w:r>
@@ -2224,6 +2348,7 @@
         <w:tc>
           <w:tcPr>
             <w:tcW w:type="dxa" w:w="960"/>
+            <w:noWrap/>
           </w:tcPr>
           <w:p>
             <w:pPr>
@@ -2232,7 +2357,7 @@
             <w:r>
               <w:rPr>
                 <w:color w:val="CC0000"/>
-                <w:sz w:val="16"/>
+                <w:sz w:val="18"/>
               </w:rPr>
               <w:t>6.5%</w:t>
             </w:r>
@@ -2241,6 +2366,7 @@
         <w:tc>
           <w:tcPr>
             <w:tcW w:type="dxa" w:w="960"/>
+            <w:noWrap/>
           </w:tcPr>
           <w:p>
             <w:pPr>
@@ -2249,7 +2375,7 @@
             <w:r>
               <w:rPr>
                 <w:color w:val="CC0000"/>
-                <w:sz w:val="16"/>
+                <w:sz w:val="18"/>
               </w:rPr>
               <w:t>€-2,303</w:t>
             </w:r>
@@ -2260,6 +2386,7 @@
         <w:tc>
           <w:tcPr>
             <w:tcW w:type="dxa" w:w="960"/>
+            <w:noWrap/>
           </w:tcPr>
           <w:p>
             <w:pPr>
@@ -2268,7 +2395,7 @@
             <w:r>
               <w:rPr>
                 <w:color w:val="CC0000"/>
-                <w:sz w:val="16"/>
+                <w:sz w:val="18"/>
               </w:rPr>
               <w:t>2013</w:t>
             </w:r>
@@ -2277,6 +2404,7 @@
         <w:tc>
           <w:tcPr>
             <w:tcW w:type="dxa" w:w="960"/>
+            <w:noWrap/>
           </w:tcPr>
           <w:p>
             <w:pPr>
@@ -2285,7 +2413,7 @@
             <w:r>
               <w:rPr>
                 <w:color w:val="CC0000"/>
-                <w:sz w:val="16"/>
+                <w:sz w:val="18"/>
               </w:rPr>
               <w:t>13</w:t>
             </w:r>
@@ -2294,6 +2422,7 @@
         <w:tc>
           <w:tcPr>
             <w:tcW w:type="dxa" w:w="960"/>
+            <w:noWrap/>
           </w:tcPr>
           <w:p>
             <w:pPr>
@@ -2302,7 +2431,7 @@
             <w:r>
               <w:rPr>
                 <w:color w:val="CC0000"/>
-                <w:sz w:val="16"/>
+                <w:sz w:val="18"/>
               </w:rPr>
               <w:t>€2,582</w:t>
             </w:r>
@@ -2311,6 +2440,7 @@
         <w:tc>
           <w:tcPr>
             <w:tcW w:type="dxa" w:w="960"/>
+            <w:noWrap/>
           </w:tcPr>
           <w:p>
             <w:pPr>
@@ -2319,7 +2449,7 @@
             <w:r>
               <w:rPr>
                 <w:color w:val="CC0000"/>
-                <w:sz w:val="16"/>
+                <w:sz w:val="18"/>
               </w:rPr>
               <w:t>7.5%</w:t>
             </w:r>
@@ -2328,6 +2458,7 @@
         <w:tc>
           <w:tcPr>
             <w:tcW w:type="dxa" w:w="960"/>
+            <w:noWrap/>
           </w:tcPr>
           <w:p>
             <w:pPr>
@@ -2336,7 +2467,7 @@
             <w:r>
               <w:rPr>
                 <w:color w:val="CC0000"/>
-                <w:sz w:val="16"/>
+                <w:sz w:val="18"/>
               </w:rPr>
               <w:t>€4,061</w:t>
             </w:r>
@@ -2345,6 +2476,7 @@
         <w:tc>
           <w:tcPr>
             <w:tcW w:type="dxa" w:w="960"/>
+            <w:noWrap/>
           </w:tcPr>
           <w:p>
             <w:pPr>
@@ -2353,7 +2485,7 @@
             <w:r>
               <w:rPr>
                 <w:color w:val="CC0000"/>
-                <w:sz w:val="16"/>
+                <w:sz w:val="18"/>
               </w:rPr>
               <w:t>11.3%</w:t>
             </w:r>
@@ -2362,6 +2494,7 @@
         <w:tc>
           <w:tcPr>
             <w:tcW w:type="dxa" w:w="960"/>
+            <w:noWrap/>
           </w:tcPr>
           <w:p>
             <w:pPr>
@@ -2370,7 +2503,7 @@
             <w:r>
               <w:rPr>
                 <w:color w:val="CC0000"/>
-                <w:sz w:val="16"/>
+                <w:sz w:val="18"/>
               </w:rPr>
               <w:t>€1,948</w:t>
             </w:r>
@@ -2379,6 +2512,7 @@
         <w:tc>
           <w:tcPr>
             <w:tcW w:type="dxa" w:w="960"/>
+            <w:noWrap/>
           </w:tcPr>
           <w:p>
             <w:pPr>
@@ -2387,7 +2521,7 @@
             <w:r>
               <w:rPr>
                 <w:color w:val="CC0000"/>
-                <w:sz w:val="16"/>
+                <w:sz w:val="18"/>
               </w:rPr>
               <w:t>5.2%</w:t>
             </w:r>
@@ -2396,6 +2530,7 @@
         <w:tc>
           <w:tcPr>
             <w:tcW w:type="dxa" w:w="960"/>
+            <w:noWrap/>
           </w:tcPr>
           <w:p>
             <w:pPr>
@@ -2404,7 +2539,7 @@
             <w:r>
               <w:rPr>
                 <w:color w:val="CC0000"/>
-                <w:sz w:val="16"/>
+                <w:sz w:val="18"/>
               </w:rPr>
               <w:t>€-1,479</w:t>
             </w:r>
@@ -2415,6 +2550,7 @@
         <w:tc>
           <w:tcPr>
             <w:tcW w:type="dxa" w:w="960"/>
+            <w:noWrap/>
           </w:tcPr>
           <w:p>
             <w:pPr>
@@ -2422,7 +2558,7 @@
             </w:pPr>
             <w:r>
               <w:rPr>
-                <w:sz w:val="16"/>
+                <w:sz w:val="18"/>
               </w:rPr>
               <w:t>2014</w:t>
             </w:r>
@@ -2431,6 +2567,7 @@
         <w:tc>
           <w:tcPr>
             <w:tcW w:type="dxa" w:w="960"/>
+            <w:noWrap/>
           </w:tcPr>
           <w:p>
             <w:pPr>
@@ -2438,7 +2575,7 @@
             </w:pPr>
             <w:r>
               <w:rPr>
-                <w:sz w:val="16"/>
+                <w:sz w:val="18"/>
               </w:rPr>
               <w:t>12</w:t>
             </w:r>
@@ -2447,6 +2584,7 @@
         <w:tc>
           <w:tcPr>
             <w:tcW w:type="dxa" w:w="960"/>
+            <w:noWrap/>
           </w:tcPr>
           <w:p>
             <w:pPr>
@@ -2454,7 +2592,7 @@
             </w:pPr>
             <w:r>
               <w:rPr>
-                <w:sz w:val="16"/>
+                <w:sz w:val="18"/>
               </w:rPr>
               <w:t>€3,466</w:t>
             </w:r>
@@ -2463,6 +2601,7 @@
         <w:tc>
           <w:tcPr>
             <w:tcW w:type="dxa" w:w="960"/>
+            <w:noWrap/>
           </w:tcPr>
           <w:p>
             <w:pPr>
@@ -2470,7 +2609,7 @@
             </w:pPr>
             <w:r>
               <w:rPr>
-                <w:sz w:val="16"/>
+                <w:sz w:val="18"/>
               </w:rPr>
               <w:t>10.8%</w:t>
             </w:r>
@@ -2479,6 +2618,7 @@
         <w:tc>
           <w:tcPr>
             <w:tcW w:type="dxa" w:w="960"/>
+            <w:noWrap/>
           </w:tcPr>
           <w:p>
             <w:pPr>
@@ -2486,7 +2626,7 @@
             </w:pPr>
             <w:r>
               <w:rPr>
-                <w:sz w:val="16"/>
+                <w:sz w:val="18"/>
               </w:rPr>
               <w:t>€3,382</w:t>
             </w:r>
@@ -2495,6 +2635,7 @@
         <w:tc>
           <w:tcPr>
             <w:tcW w:type="dxa" w:w="960"/>
+            <w:noWrap/>
           </w:tcPr>
           <w:p>
             <w:pPr>
@@ -2502,7 +2643,7 @@
             </w:pPr>
             <w:r>
               <w:rPr>
-                <w:sz w:val="16"/>
+                <w:sz w:val="18"/>
               </w:rPr>
               <w:t>10.6%</w:t>
             </w:r>
@@ -2511,6 +2652,7 @@
         <w:tc>
           <w:tcPr>
             <w:tcW w:type="dxa" w:w="960"/>
+            <w:noWrap/>
           </w:tcPr>
           <w:p>
             <w:pPr>
@@ -2518,7 +2660,7 @@
             </w:pPr>
             <w:r>
               <w:rPr>
-                <w:sz w:val="16"/>
+                <w:sz w:val="18"/>
               </w:rPr>
               <w:t>€1,666</w:t>
             </w:r>
@@ -2527,6 +2669,7 @@
         <w:tc>
           <w:tcPr>
             <w:tcW w:type="dxa" w:w="960"/>
+            <w:noWrap/>
           </w:tcPr>
           <w:p>
             <w:pPr>
@@ -2534,7 +2677,7 @@
             </w:pPr>
             <w:r>
               <w:rPr>
-                <w:sz w:val="16"/>
+                <w:sz w:val="18"/>
               </w:rPr>
               <w:t>4.3%</w:t>
             </w:r>
@@ -2543,6 +2686,7 @@
         <w:tc>
           <w:tcPr>
             <w:tcW w:type="dxa" w:w="960"/>
+            <w:noWrap/>
           </w:tcPr>
           <w:p>
             <w:pPr>
@@ -2551,7 +2695,7 @@
             <w:r>
               <w:rPr>
                 <w:color w:val="008000"/>
-                <w:sz w:val="16"/>
+                <w:sz w:val="18"/>
               </w:rPr>
               <w:t>+€83</w:t>
             </w:r>
@@ -2562,6 +2706,7 @@
         <w:tc>
           <w:tcPr>
             <w:tcW w:type="dxa" w:w="960"/>
+            <w:noWrap/>
           </w:tcPr>
           <w:p>
             <w:pPr>
@@ -2569,7 +2714,7 @@
             </w:pPr>
             <w:r>
               <w:rPr>
-                <w:sz w:val="16"/>
+                <w:sz w:val="18"/>
               </w:rPr>
               <w:t>2015</w:t>
             </w:r>
@@ -2578,6 +2723,7 @@
         <w:tc>
           <w:tcPr>
             <w:tcW w:type="dxa" w:w="960"/>
+            <w:noWrap/>
           </w:tcPr>
           <w:p>
             <w:pPr>
@@ -2585,7 +2731,7 @@
             </w:pPr>
             <w:r>
               <w:rPr>
-                <w:sz w:val="16"/>
+                <w:sz w:val="18"/>
               </w:rPr>
               <w:t>11</w:t>
             </w:r>
@@ -2594,6 +2740,7 @@
         <w:tc>
           <w:tcPr>
             <w:tcW w:type="dxa" w:w="960"/>
+            <w:noWrap/>
           </w:tcPr>
           <w:p>
             <w:pPr>
@@ -2601,7 +2748,7 @@
             </w:pPr>
             <w:r>
               <w:rPr>
-                <w:sz w:val="16"/>
+                <w:sz w:val="18"/>
               </w:rPr>
               <w:t>€4,019</w:t>
             </w:r>
@@ -2610,6 +2757,7 @@
         <w:tc>
           <w:tcPr>
             <w:tcW w:type="dxa" w:w="960"/>
+            <w:noWrap/>
           </w:tcPr>
           <w:p>
             <w:pPr>
@@ -2617,7 +2765,7 @@
             </w:pPr>
             <w:r>
               <w:rPr>
-                <w:sz w:val="16"/>
+                <w:sz w:val="18"/>
               </w:rPr>
               <w:t>13.3%</w:t>
             </w:r>
@@ -2626,6 +2774,7 @@
         <w:tc>
           <w:tcPr>
             <w:tcW w:type="dxa" w:w="960"/>
+            <w:noWrap/>
           </w:tcPr>
           <w:p>
             <w:pPr>
@@ -2633,7 +2782,7 @@
             </w:pPr>
             <w:r>
               <w:rPr>
-                <w:sz w:val="16"/>
+                <w:sz w:val="18"/>
               </w:rPr>
               <w:t>€3,532</w:t>
             </w:r>
@@ -2642,6 +2791,7 @@
         <w:tc>
           <w:tcPr>
             <w:tcW w:type="dxa" w:w="960"/>
+            <w:noWrap/>
           </w:tcPr>
           <w:p>
             <w:pPr>
@@ -2649,7 +2799,7 @@
             </w:pPr>
             <w:r>
               <w:rPr>
-                <w:sz w:val="16"/>
+                <w:sz w:val="18"/>
               </w:rPr>
               <w:t>12.0%</w:t>
             </w:r>
@@ -2658,6 +2808,7 @@
         <w:tc>
           <w:tcPr>
             <w:tcW w:type="dxa" w:w="960"/>
+            <w:noWrap/>
           </w:tcPr>
           <w:p>
             <w:pPr>
@@ -2665,7 +2816,7 @@
             </w:pPr>
             <w:r>
               <w:rPr>
-                <w:sz w:val="16"/>
+                <w:sz w:val="18"/>
               </w:rPr>
               <w:t>€2,027</w:t>
             </w:r>
@@ -2674,6 +2825,7 @@
         <w:tc>
           <w:tcPr>
             <w:tcW w:type="dxa" w:w="960"/>
+            <w:noWrap/>
           </w:tcPr>
           <w:p>
             <w:pPr>
@@ -2681,7 +2833,7 @@
             </w:pPr>
             <w:r>
               <w:rPr>
-                <w:sz w:val="16"/>
+                <w:sz w:val="18"/>
               </w:rPr>
               <w:t>6.6%</w:t>
             </w:r>
@@ -2690,6 +2842,7 @@
         <w:tc>
           <w:tcPr>
             <w:tcW w:type="dxa" w:w="960"/>
+            <w:noWrap/>
           </w:tcPr>
           <w:p>
             <w:pPr>
@@ -2698,7 +2851,7 @@
             <w:r>
               <w:rPr>
                 <w:color w:val="008000"/>
-                <w:sz w:val="16"/>
+                <w:sz w:val="18"/>
               </w:rPr>
               <w:t>+€487</w:t>
             </w:r>
@@ -2709,6 +2862,7 @@
         <w:tc>
           <w:tcPr>
             <w:tcW w:type="dxa" w:w="960"/>
+            <w:noWrap/>
           </w:tcPr>
           <w:p>
             <w:pPr>
@@ -2716,7 +2870,7 @@
             </w:pPr>
             <w:r>
               <w:rPr>
-                <w:sz w:val="16"/>
+                <w:sz w:val="18"/>
               </w:rPr>
               <w:t>2016</w:t>
             </w:r>
@@ -2725,6 +2879,7 @@
         <w:tc>
           <w:tcPr>
             <w:tcW w:type="dxa" w:w="960"/>
+            <w:noWrap/>
           </w:tcPr>
           <w:p>
             <w:pPr>
@@ -2732,7 +2887,7 @@
             </w:pPr>
             <w:r>
               <w:rPr>
-                <w:sz w:val="16"/>
+                <w:sz w:val="18"/>
               </w:rPr>
               <w:t>10</w:t>
             </w:r>
@@ -2741,6 +2896,7 @@
         <w:tc>
           <w:tcPr>
             <w:tcW w:type="dxa" w:w="960"/>
+            <w:noWrap/>
           </w:tcPr>
           <w:p>
             <w:pPr>
@@ -2748,7 +2904,7 @@
             </w:pPr>
             <w:r>
               <w:rPr>
-                <w:sz w:val="16"/>
+                <w:sz w:val="18"/>
               </w:rPr>
               <w:t>€4,765</w:t>
             </w:r>
@@ -2757,6 +2913,7 @@
         <w:tc>
           <w:tcPr>
             <w:tcW w:type="dxa" w:w="960"/>
+            <w:noWrap/>
           </w:tcPr>
           <w:p>
             <w:pPr>
@@ -2764,7 +2921,7 @@
             </w:pPr>
             <w:r>
               <w:rPr>
-                <w:sz w:val="16"/>
+                <w:sz w:val="18"/>
               </w:rPr>
               <w:t>16.7%</w:t>
             </w:r>
@@ -2773,6 +2930,7 @@
         <w:tc>
           <w:tcPr>
             <w:tcW w:type="dxa" w:w="960"/>
+            <w:noWrap/>
           </w:tcPr>
           <w:p>
             <w:pPr>
@@ -2780,7 +2938,7 @@
             </w:pPr>
             <w:r>
               <w:rPr>
-                <w:sz w:val="16"/>
+                <w:sz w:val="18"/>
               </w:rPr>
               <w:t>€3,673</w:t>
             </w:r>
@@ -2789,6 +2947,7 @@
         <w:tc>
           <w:tcPr>
             <w:tcW w:type="dxa" w:w="960"/>
+            <w:noWrap/>
           </w:tcPr>
           <w:p>
             <w:pPr>
@@ -2796,7 +2955,7 @@
             </w:pPr>
             <w:r>
               <w:rPr>
-                <w:sz w:val="16"/>
+                <w:sz w:val="18"/>
               </w:rPr>
               <w:t>13.7%</w:t>
             </w:r>
@@ -2805,6 +2964,7 @@
         <w:tc>
           <w:tcPr>
             <w:tcW w:type="dxa" w:w="960"/>
+            <w:noWrap/>
           </w:tcPr>
           <w:p>
             <w:pPr>
@@ -2812,7 +2972,7 @@
             </w:pPr>
             <w:r>
               <w:rPr>
-                <w:sz w:val="16"/>
+                <w:sz w:val="18"/>
               </w:rPr>
               <w:t>€2,340</w:t>
             </w:r>
@@ -2821,6 +2981,7 @@
         <w:tc>
           <w:tcPr>
             <w:tcW w:type="dxa" w:w="960"/>
+            <w:noWrap/>
           </w:tcPr>
           <w:p>
             <w:pPr>
@@ -2828,7 +2989,7 @@
             </w:pPr>
             <w:r>
               <w:rPr>
-                <w:sz w:val="16"/>
+                <w:sz w:val="18"/>
               </w:rPr>
               <w:t>8.8%</w:t>
             </w:r>
@@ -2837,6 +2998,7 @@
         <w:tc>
           <w:tcPr>
             <w:tcW w:type="dxa" w:w="960"/>
+            <w:noWrap/>
           </w:tcPr>
           <w:p>
             <w:pPr>
@@ -2845,7 +3007,7 @@
             <w:r>
               <w:rPr>
                 <w:color w:val="008000"/>
-                <w:sz w:val="16"/>
+                <w:sz w:val="18"/>
               </w:rPr>
               <w:t>+€1,092</w:t>
             </w:r>
@@ -2856,6 +3018,7 @@
         <w:tc>
           <w:tcPr>
             <w:tcW w:type="dxa" w:w="960"/>
+            <w:noWrap/>
           </w:tcPr>
           <w:p>
             <w:pPr>
@@ -2863,7 +3026,7 @@
             </w:pPr>
             <w:r>
               <w:rPr>
-                <w:sz w:val="16"/>
+                <w:sz w:val="18"/>
               </w:rPr>
               <w:t>2017</w:t>
             </w:r>
@@ -2872,6 +3035,7 @@
         <w:tc>
           <w:tcPr>
             <w:tcW w:type="dxa" w:w="960"/>
+            <w:noWrap/>
           </w:tcPr>
           <w:p>
             <w:pPr>
@@ -2879,7 +3043,7 @@
             </w:pPr>
             <w:r>
               <w:rPr>
-                <w:sz w:val="16"/>
+                <w:sz w:val="18"/>
               </w:rPr>
               <w:t>9</w:t>
             </w:r>
@@ -2888,6 +3052,7 @@
         <w:tc>
           <w:tcPr>
             <w:tcW w:type="dxa" w:w="960"/>
+            <w:noWrap/>
           </w:tcPr>
           <w:p>
             <w:pPr>
@@ -2895,7 +3060,7 @@
             </w:pPr>
             <w:r>
               <w:rPr>
-                <w:sz w:val="16"/>
+                <w:sz w:val="18"/>
               </w:rPr>
               <w:t>€4,469</w:t>
             </w:r>
@@ -2904,6 +3069,7 @@
         <w:tc>
           <w:tcPr>
             <w:tcW w:type="dxa" w:w="960"/>
+            <w:noWrap/>
           </w:tcPr>
           <w:p>
             <w:pPr>
@@ -2911,7 +3077,7 @@
             </w:pPr>
             <w:r>
               <w:rPr>
-                <w:sz w:val="16"/>
+                <w:sz w:val="18"/>
               </w:rPr>
               <w:t>17.9%</w:t>
             </w:r>
@@ -2920,6 +3086,7 @@
         <w:tc>
           <w:tcPr>
             <w:tcW w:type="dxa" w:w="960"/>
+            <w:noWrap/>
           </w:tcPr>
           <w:p>
             <w:pPr>
@@ -2927,7 +3094,7 @@
             </w:pPr>
             <w:r>
               <w:rPr>
-                <w:sz w:val="16"/>
+                <w:sz w:val="18"/>
               </w:rPr>
               <w:t>€3,135</w:t>
             </w:r>
@@ -2936,6 +3103,7 @@
         <w:tc>
           <w:tcPr>
             <w:tcW w:type="dxa" w:w="960"/>
+            <w:noWrap/>
           </w:tcPr>
           <w:p>
             <w:pPr>
@@ -2943,7 +3111,7 @@
             </w:pPr>
             <w:r>
               <w:rPr>
-                <w:sz w:val="16"/>
+                <w:sz w:val="18"/>
               </w:rPr>
               <w:t>13.4%</w:t>
             </w:r>
@@ -2952,6 +3120,7 @@
         <w:tc>
           <w:tcPr>
             <w:tcW w:type="dxa" w:w="960"/>
+            <w:noWrap/>
           </w:tcPr>
           <w:p>
             <w:pPr>
@@ -2959,7 +3128,7 @@
             </w:pPr>
             <w:r>
               <w:rPr>
-                <w:sz w:val="16"/>
+                <w:sz w:val="18"/>
               </w:rPr>
               <w:t>€2,072</w:t>
             </w:r>
@@ -2968,6 +3137,7 @@
         <w:tc>
           <w:tcPr>
             <w:tcW w:type="dxa" w:w="960"/>
+            <w:noWrap/>
           </w:tcPr>
           <w:p>
             <w:pPr>
@@ -2975,7 +3145,7 @@
             </w:pPr>
             <w:r>
               <w:rPr>
-                <w:sz w:val="16"/>
+                <w:sz w:val="18"/>
               </w:rPr>
               <w:t>8.3%</w:t>
             </w:r>
@@ -2984,6 +3154,7 @@
         <w:tc>
           <w:tcPr>
             <w:tcW w:type="dxa" w:w="960"/>
+            <w:noWrap/>
           </w:tcPr>
           <w:p>
             <w:pPr>
@@ -2992,7 +3163,7 @@
             <w:r>
               <w:rPr>
                 <w:color w:val="008000"/>
-                <w:sz w:val="16"/>
+                <w:sz w:val="18"/>
               </w:rPr>
               <w:t>+€1,334</w:t>
             </w:r>
@@ -3003,6 +3174,7 @@
         <w:tc>
           <w:tcPr>
             <w:tcW w:type="dxa" w:w="960"/>
+            <w:noWrap/>
           </w:tcPr>
           <w:p>
             <w:pPr>
@@ -3010,7 +3182,7 @@
             </w:pPr>
             <w:r>
               <w:rPr>
-                <w:sz w:val="16"/>
+                <w:sz w:val="18"/>
               </w:rPr>
               <w:t>2018</w:t>
             </w:r>
@@ -3019,6 +3191,7 @@
         <w:tc>
           <w:tcPr>
             <w:tcW w:type="dxa" w:w="960"/>
+            <w:noWrap/>
           </w:tcPr>
           <w:p>
             <w:pPr>
@@ -3026,7 +3199,7 @@
             </w:pPr>
             <w:r>
               <w:rPr>
-                <w:sz w:val="16"/>
+                <w:sz w:val="18"/>
               </w:rPr>
               <w:t>8</w:t>
             </w:r>
@@ -3035,6 +3208,7 @@
         <w:tc>
           <w:tcPr>
             <w:tcW w:type="dxa" w:w="960"/>
+            <w:noWrap/>
           </w:tcPr>
           <w:p>
             <w:pPr>
@@ -3042,7 +3216,7 @@
             </w:pPr>
             <w:r>
               <w:rPr>
-                <w:sz w:val="16"/>
+                <w:sz w:val="18"/>
               </w:rPr>
               <w:t>€3,483</w:t>
             </w:r>
@@ -3051,6 +3225,7 @@
         <w:tc>
           <w:tcPr>
             <w:tcW w:type="dxa" w:w="960"/>
+            <w:noWrap/>
           </w:tcPr>
           <w:p>
             <w:pPr>
@@ -3058,7 +3233,7 @@
             </w:pPr>
             <w:r>
               <w:rPr>
-                <w:sz w:val="16"/>
+                <w:sz w:val="18"/>
               </w:rPr>
               <w:t>16.6%</w:t>
             </w:r>
@@ -3067,6 +3242,7 @@
         <w:tc>
           <w:tcPr>
             <w:tcW w:type="dxa" w:w="960"/>
+            <w:noWrap/>
           </w:tcPr>
           <w:p>
             <w:pPr>
@@ -3074,7 +3250,7 @@
             </w:pPr>
             <w:r>
               <w:rPr>
-                <w:sz w:val="16"/>
+                <w:sz w:val="18"/>
               </w:rPr>
               <w:t>€2,200</w:t>
             </w:r>
@@ -3083,6 +3259,7 @@
         <w:tc>
           <w:tcPr>
             <w:tcW w:type="dxa" w:w="960"/>
+            <w:noWrap/>
           </w:tcPr>
           <w:p>
             <w:pPr>
@@ -3090,7 +3267,7 @@
             </w:pPr>
             <w:r>
               <w:rPr>
-                <w:sz w:val="16"/>
+                <w:sz w:val="18"/>
               </w:rPr>
               <w:t>10.2%</w:t>
             </w:r>
@@ -3099,6 +3276,7 @@
         <w:tc>
           <w:tcPr>
             <w:tcW w:type="dxa" w:w="960"/>
+            <w:noWrap/>
           </w:tcPr>
           <w:p>
             <w:pPr>
@@ -3106,7 +3284,7 @@
             </w:pPr>
             <w:r>
               <w:rPr>
-                <w:sz w:val="16"/>
+                <w:sz w:val="18"/>
               </w:rPr>
               <w:t>€1,415</w:t>
             </w:r>
@@ -3115,6 +3293,7 @@
         <w:tc>
           <w:tcPr>
             <w:tcW w:type="dxa" w:w="960"/>
+            <w:noWrap/>
           </w:tcPr>
           <w:p>
             <w:pPr>
@@ -3122,7 +3301,7 @@
             </w:pPr>
             <w:r>
               <w:rPr>
-                <w:sz w:val="16"/>
+                <w:sz w:val="18"/>
               </w:rPr>
               <w:t>4.4%</w:t>
             </w:r>
@@ -3131,6 +3310,7 @@
         <w:tc>
           <w:tcPr>
             <w:tcW w:type="dxa" w:w="960"/>
+            <w:noWrap/>
           </w:tcPr>
           <w:p>
             <w:pPr>
@@ -3139,7 +3319,7 @@
             <w:r>
               <w:rPr>
                 <w:color w:val="008000"/>
-                <w:sz w:val="16"/>
+                <w:sz w:val="18"/>
               </w:rPr>
               <w:t>+€1,283</w:t>
             </w:r>
@@ -3150,6 +3330,7 @@
         <w:tc>
           <w:tcPr>
             <w:tcW w:type="dxa" w:w="960"/>
+            <w:noWrap/>
           </w:tcPr>
           <w:p>
             <w:pPr>
@@ -3157,7 +3338,7 @@
             </w:pPr>
             <w:r>
               <w:rPr>
-                <w:sz w:val="16"/>
+                <w:sz w:val="18"/>
               </w:rPr>
               <w:t>2019</w:t>
             </w:r>
@@ -3166,6 +3347,7 @@
         <w:tc>
           <w:tcPr>
             <w:tcW w:type="dxa" w:w="960"/>
+            <w:noWrap/>
           </w:tcPr>
           <w:p>
             <w:pPr>
@@ -3173,7 +3355,7 @@
             </w:pPr>
             <w:r>
               <w:rPr>
-                <w:sz w:val="16"/>
+                <w:sz w:val="18"/>
               </w:rPr>
               <w:t>7</w:t>
             </w:r>
@@ -3182,6 +3364,7 @@
         <w:tc>
           <w:tcPr>
             <w:tcW w:type="dxa" w:w="960"/>
+            <w:noWrap/>
           </w:tcPr>
           <w:p>
             <w:pPr>
@@ -3189,7 +3372,7 @@
             </w:pPr>
             <w:r>
               <w:rPr>
-                <w:sz w:val="16"/>
+                <w:sz w:val="18"/>
               </w:rPr>
               <w:t>€3,831</w:t>
             </w:r>
@@ -3198,6 +3381,7 @@
         <w:tc>
           <w:tcPr>
             <w:tcW w:type="dxa" w:w="960"/>
+            <w:noWrap/>
           </w:tcPr>
           <w:p>
             <w:pPr>
@@ -3205,7 +3389,7 @@
             </w:pPr>
             <w:r>
               <w:rPr>
-                <w:sz w:val="16"/>
+                <w:sz w:val="18"/>
               </w:rPr>
               <w:t>20.8%</w:t>
             </w:r>
@@ -3214,6 +3398,7 @@
         <w:tc>
           <w:tcPr>
             <w:tcW w:type="dxa" w:w="960"/>
+            <w:noWrap/>
           </w:tcPr>
           <w:p>
             <w:pPr>
@@ -3221,7 +3406,7 @@
             </w:pPr>
             <w:r>
               <w:rPr>
-                <w:sz w:val="16"/>
+                <w:sz w:val="18"/>
               </w:rPr>
               <w:t>€2,422</w:t>
             </w:r>
@@ -3230,6 +3415,7 @@
         <w:tc>
           <w:tcPr>
             <w:tcW w:type="dxa" w:w="960"/>
+            <w:noWrap/>
           </w:tcPr>
           <w:p>
             <w:pPr>
@@ -3237,7 +3423,7 @@
             </w:pPr>
             <w:r>
               <w:rPr>
-                <w:sz w:val="16"/>
+                <w:sz w:val="18"/>
               </w:rPr>
               <w:t>13.2%</w:t>
             </w:r>
@@ -3246,6 +3432,7 @@
         <w:tc>
           <w:tcPr>
             <w:tcW w:type="dxa" w:w="960"/>
+            <w:noWrap/>
           </w:tcPr>
           <w:p>
             <w:pPr>
@@ -3253,7 +3440,7 @@
             </w:pPr>
             <w:r>
               <w:rPr>
-                <w:sz w:val="16"/>
+                <w:sz w:val="18"/>
               </w:rPr>
               <w:t>€1,892</w:t>
             </w:r>
@@ -3262,6 +3449,7 @@
         <w:tc>
           <w:tcPr>
             <w:tcW w:type="dxa" w:w="960"/>
+            <w:noWrap/>
           </w:tcPr>
           <w:p>
             <w:pPr>
@@ -3269,7 +3457,7 @@
             </w:pPr>
             <w:r>
               <w:rPr>
-                <w:sz w:val="16"/>
+                <w:sz w:val="18"/>
               </w:rPr>
               <w:t>9.4%</w:t>
             </w:r>
@@ -3278,6 +3466,7 @@
         <w:tc>
           <w:tcPr>
             <w:tcW w:type="dxa" w:w="960"/>
+            <w:noWrap/>
           </w:tcPr>
           <w:p>
             <w:pPr>
@@ -3286,7 +3475,7 @@
             <w:r>
               <w:rPr>
                 <w:color w:val="008000"/>
-                <w:sz w:val="16"/>
+                <w:sz w:val="18"/>
               </w:rPr>
               <w:t>+€1,410</w:t>
             </w:r>
@@ -3297,6 +3486,7 @@
         <w:tc>
           <w:tcPr>
             <w:tcW w:type="dxa" w:w="960"/>
+            <w:noWrap/>
           </w:tcPr>
           <w:p>
             <w:pPr>
@@ -3304,7 +3494,7 @@
             </w:pPr>
             <w:r>
               <w:rPr>
-                <w:sz w:val="16"/>
+                <w:sz w:val="18"/>
               </w:rPr>
               <w:t>2020</w:t>
             </w:r>
@@ -3313,6 +3503,7 @@
         <w:tc>
           <w:tcPr>
             <w:tcW w:type="dxa" w:w="960"/>
+            <w:noWrap/>
           </w:tcPr>
           <w:p>
             <w:pPr>
@@ -3320,7 +3511,7 @@
             </w:pPr>
             <w:r>
               <w:rPr>
-                <w:sz w:val="16"/>
+                <w:sz w:val="18"/>
               </w:rPr>
               <w:t>6</w:t>
             </w:r>
@@ -3329,6 +3520,7 @@
         <w:tc>
           <w:tcPr>
             <w:tcW w:type="dxa" w:w="960"/>
+            <w:noWrap/>
           </w:tcPr>
           <w:p>
             <w:pPr>
@@ -3336,7 +3528,7 @@
             </w:pPr>
             <w:r>
               <w:rPr>
-                <w:sz w:val="16"/>
+                <w:sz w:val="18"/>
               </w:rPr>
               <w:t>€3,320</w:t>
             </w:r>
@@ -3345,6 +3537,7 @@
         <w:tc>
           <w:tcPr>
             <w:tcW w:type="dxa" w:w="960"/>
+            <w:noWrap/>
           </w:tcPr>
           <w:p>
             <w:pPr>
@@ -3352,7 +3545,7 @@
             </w:pPr>
             <w:r>
               <w:rPr>
-                <w:sz w:val="16"/>
+                <w:sz w:val="18"/>
               </w:rPr>
               <w:t>21.7%</w:t>
             </w:r>
@@ -3361,6 +3554,7 @@
         <w:tc>
           <w:tcPr>
             <w:tcW w:type="dxa" w:w="960"/>
+            <w:noWrap/>
           </w:tcPr>
           <w:p>
             <w:pPr>
@@ -3368,7 +3562,7 @@
             </w:pPr>
             <w:r>
               <w:rPr>
-                <w:sz w:val="16"/>
+                <w:sz w:val="18"/>
               </w:rPr>
               <w:t>€2,095</w:t>
             </w:r>
@@ -3377,6 +3571,7 @@
         <w:tc>
           <w:tcPr>
             <w:tcW w:type="dxa" w:w="960"/>
+            <w:noWrap/>
           </w:tcPr>
           <w:p>
             <w:pPr>
@@ -3384,7 +3579,7 @@
             </w:pPr>
             <w:r>
               <w:rPr>
-                <w:sz w:val="16"/>
+                <w:sz w:val="18"/>
               </w:rPr>
               <w:t>12.9%</w:t>
             </w:r>
@@ -3393,6 +3588,7 @@
         <w:tc>
           <w:tcPr>
             <w:tcW w:type="dxa" w:w="960"/>
+            <w:noWrap/>
           </w:tcPr>
           <w:p>
             <w:pPr>
@@ -3400,7 +3596,7 @@
             </w:pPr>
             <w:r>
               <w:rPr>
-                <w:sz w:val="16"/>
+                <w:sz w:val="18"/>
               </w:rPr>
               <w:t>€1,772</w:t>
             </w:r>
@@ -3409,6 +3605,7 @@
         <w:tc>
           <w:tcPr>
             <w:tcW w:type="dxa" w:w="960"/>
+            <w:noWrap/>
           </w:tcPr>
           <w:p>
             <w:pPr>
@@ -3416,7 +3613,7 @@
             </w:pPr>
             <w:r>
               <w:rPr>
-                <w:sz w:val="16"/>
+                <w:sz w:val="18"/>
               </w:rPr>
               <w:t>9.8%</w:t>
             </w:r>
@@ -3425,6 +3622,7 @@
         <w:tc>
           <w:tcPr>
             <w:tcW w:type="dxa" w:w="960"/>
+            <w:noWrap/>
           </w:tcPr>
           <w:p>
             <w:pPr>
@@ -3433,7 +3631,7 @@
             <w:r>
               <w:rPr>
                 <w:color w:val="008000"/>
-                <w:sz w:val="16"/>
+                <w:sz w:val="18"/>
               </w:rPr>
               <w:t>+€1,225</w:t>
             </w:r>
@@ -3444,6 +3642,7 @@
         <w:tc>
           <w:tcPr>
             <w:tcW w:type="dxa" w:w="960"/>
+            <w:noWrap/>
           </w:tcPr>
           <w:p>
             <w:pPr>
@@ -3451,7 +3650,7 @@
             </w:pPr>
             <w:r>
               <w:rPr>
-                <w:sz w:val="16"/>
+                <w:sz w:val="18"/>
               </w:rPr>
               <w:t>2021</w:t>
             </w:r>
@@ -3460,6 +3659,7 @@
         <w:tc>
           <w:tcPr>
             <w:tcW w:type="dxa" w:w="960"/>
+            <w:noWrap/>
           </w:tcPr>
           <w:p>
             <w:pPr>
@@ -3467,7 +3667,7 @@
             </w:pPr>
             <w:r>
               <w:rPr>
-                <w:sz w:val="16"/>
+                <w:sz w:val="18"/>
               </w:rPr>
               <w:t>5</w:t>
             </w:r>
@@ -3476,6 +3676,7 @@
         <w:tc>
           <w:tcPr>
             <w:tcW w:type="dxa" w:w="960"/>
+            <w:noWrap/>
           </w:tcPr>
           <w:p>
             <w:pPr>
@@ -3483,7 +3684,7 @@
             </w:pPr>
             <w:r>
               <w:rPr>
-                <w:sz w:val="16"/>
+                <w:sz w:val="18"/>
               </w:rPr>
               <w:t>€2,591</w:t>
             </w:r>
@@ -3492,6 +3693,7 @@
         <w:tc>
           <w:tcPr>
             <w:tcW w:type="dxa" w:w="960"/>
+            <w:noWrap/>
           </w:tcPr>
           <w:p>
             <w:pPr>
@@ -3499,7 +3701,7 @@
             </w:pPr>
             <w:r>
               <w:rPr>
-                <w:sz w:val="16"/>
+                <w:sz w:val="18"/>
               </w:rPr>
               <w:t>20.4%</w:t>
             </w:r>
@@ -3508,6 +3710,7 @@
         <w:tc>
           <w:tcPr>
             <w:tcW w:type="dxa" w:w="960"/>
+            <w:noWrap/>
           </w:tcPr>
           <w:p>
             <w:pPr>
@@ -3515,7 +3718,7 @@
             </w:pPr>
             <w:r>
               <w:rPr>
-                <w:sz w:val="16"/>
+                <w:sz w:val="18"/>
               </w:rPr>
               <w:t>€1,669</w:t>
             </w:r>
@@ -3524,6 +3727,7 @@
         <w:tc>
           <w:tcPr>
             <w:tcW w:type="dxa" w:w="960"/>
+            <w:noWrap/>
           </w:tcPr>
           <w:p>
             <w:pPr>
@@ -3531,7 +3735,7 @@
             </w:pPr>
             <w:r>
               <w:rPr>
-                <w:sz w:val="16"/>
+                <w:sz w:val="18"/>
               </w:rPr>
               <w:t>10.5%</w:t>
             </w:r>
@@ -3540,6 +3744,7 @@
         <w:tc>
           <w:tcPr>
             <w:tcW w:type="dxa" w:w="960"/>
+            <w:noWrap/>
           </w:tcPr>
           <w:p>
             <w:pPr>
@@ -3547,7 +3752,7 @@
             </w:pPr>
             <w:r>
               <w:rPr>
-                <w:sz w:val="16"/>
+                <w:sz w:val="18"/>
               </w:rPr>
               <w:t>€1,457</w:t>
             </w:r>
@@ -3556,6 +3761,7 @@
         <w:tc>
           <w:tcPr>
             <w:tcW w:type="dxa" w:w="960"/>
+            <w:noWrap/>
           </w:tcPr>
           <w:p>
             <w:pPr>
@@ -3563,7 +3769,7 @@
             </w:pPr>
             <w:r>
               <w:rPr>
-                <w:sz w:val="16"/>
+                <w:sz w:val="18"/>
               </w:rPr>
               <w:t>7.6%</w:t>
             </w:r>
@@ -3572,6 +3778,7 @@
         <w:tc>
           <w:tcPr>
             <w:tcW w:type="dxa" w:w="960"/>
+            <w:noWrap/>
           </w:tcPr>
           <w:p>
             <w:pPr>
@@ -3580,7 +3787,7 @@
             <w:r>
               <w:rPr>
                 <w:color w:val="008000"/>
-                <w:sz w:val="16"/>
+                <w:sz w:val="18"/>
               </w:rPr>
               <w:t>+€922</w:t>
             </w:r>
@@ -3591,6 +3798,7 @@
         <w:tc>
           <w:tcPr>
             <w:tcW w:type="dxa" w:w="960"/>
+            <w:noWrap/>
           </w:tcPr>
           <w:p>
             <w:pPr>
@@ -3598,7 +3806,7 @@
             </w:pPr>
             <w:r>
               <w:rPr>
-                <w:sz w:val="16"/>
+                <w:sz w:val="18"/>
               </w:rPr>
               <w:t>2022</w:t>
             </w:r>
@@ -3607,6 +3815,7 @@
         <w:tc>
           <w:tcPr>
             <w:tcW w:type="dxa" w:w="960"/>
+            <w:noWrap/>
           </w:tcPr>
           <w:p>
             <w:pPr>
@@ -3614,7 +3823,7 @@
             </w:pPr>
             <w:r>
               <w:rPr>
-                <w:sz w:val="16"/>
+                <w:sz w:val="18"/>
               </w:rPr>
               <w:t>4</w:t>
             </w:r>
@@ -3623,6 +3832,7 @@
         <w:tc>
           <w:tcPr>
             <w:tcW w:type="dxa" w:w="960"/>
+            <w:noWrap/>
           </w:tcPr>
           <w:p>
             <w:pPr>
@@ -3630,7 +3840,7 @@
             </w:pPr>
             <w:r>
               <w:rPr>
-                <w:sz w:val="16"/>
+                <w:sz w:val="18"/>
               </w:rPr>
               <w:t>€2,901</w:t>
             </w:r>
@@ -3639,6 +3849,7 @@
         <w:tc>
           <w:tcPr>
             <w:tcW w:type="dxa" w:w="960"/>
+            <w:noWrap/>
           </w:tcPr>
           <w:p>
             <w:pPr>
@@ -3646,7 +3857,7 @@
             </w:pPr>
             <w:r>
               <w:rPr>
-                <w:sz w:val="16"/>
+                <w:sz w:val="18"/>
               </w:rPr>
               <w:t>29.6%</w:t>
             </w:r>
@@ -3655,6 +3866,7 @@
         <w:tc>
           <w:tcPr>
             <w:tcW w:type="dxa" w:w="960"/>
+            <w:noWrap/>
           </w:tcPr>
           <w:p>
             <w:pPr>
@@ -3662,7 +3874,7 @@
             </w:pPr>
             <w:r>
               <w:rPr>
-                <w:sz w:val="16"/>
+                <w:sz w:val="18"/>
               </w:rPr>
               <w:t>€1,494</w:t>
             </w:r>
@@ -3671,6 +3883,7 @@
         <w:tc>
           <w:tcPr>
             <w:tcW w:type="dxa" w:w="960"/>
+            <w:noWrap/>
           </w:tcPr>
           <w:p>
             <w:pPr>
@@ -3678,7 +3891,7 @@
             </w:pPr>
             <w:r>
               <w:rPr>
-                <w:sz w:val="16"/>
+                <w:sz w:val="18"/>
               </w:rPr>
               <w:t>10.3%</w:t>
             </w:r>
@@ -3687,6 +3900,7 @@
         <w:tc>
           <w:tcPr>
             <w:tcW w:type="dxa" w:w="960"/>
+            <w:noWrap/>
           </w:tcPr>
           <w:p>
             <w:pPr>
@@ -3694,7 +3908,7 @@
             </w:pPr>
             <w:r>
               <w:rPr>
-                <w:sz w:val="16"/>
+                <w:sz w:val="18"/>
               </w:rPr>
               <w:t>€1,492</w:t>
             </w:r>
@@ -3703,6 +3917,7 @@
         <w:tc>
           <w:tcPr>
             <w:tcW w:type="dxa" w:w="960"/>
+            <w:noWrap/>
           </w:tcPr>
           <w:p>
             <w:pPr>
@@ -3710,7 +3925,7 @@
             </w:pPr>
             <w:r>
               <w:rPr>
-                <w:sz w:val="16"/>
+                <w:sz w:val="18"/>
               </w:rPr>
               <w:t>10.2%</w:t>
             </w:r>
@@ -3719,6 +3934,7 @@
         <w:tc>
           <w:tcPr>
             <w:tcW w:type="dxa" w:w="960"/>
+            <w:noWrap/>
           </w:tcPr>
           <w:p>
             <w:pPr>
@@ -3727,7 +3943,7 @@
             <w:r>
               <w:rPr>
                 <w:color w:val="008000"/>
-                <w:sz w:val="16"/>
+                <w:sz w:val="18"/>
               </w:rPr>
               <w:t>+€1,407</w:t>
             </w:r>
@@ -3738,6 +3954,7 @@
         <w:tc>
           <w:tcPr>
             <w:tcW w:type="dxa" w:w="960"/>
+            <w:noWrap/>
           </w:tcPr>
           <w:p>
             <w:pPr>
@@ -3745,7 +3962,7 @@
             </w:pPr>
             <w:r>
               <w:rPr>
-                <w:sz w:val="16"/>
+                <w:sz w:val="18"/>
               </w:rPr>
               <w:t>2023</w:t>
             </w:r>
@@ -3754,6 +3971,7 @@
         <w:tc>
           <w:tcPr>
             <w:tcW w:type="dxa" w:w="960"/>
+            <w:noWrap/>
           </w:tcPr>
           <w:p>
             <w:pPr>
@@ -3761,7 +3979,7 @@
             </w:pPr>
             <w:r>
               <w:rPr>
-                <w:sz w:val="16"/>
+                <w:sz w:val="18"/>
               </w:rPr>
               <w:t>3</w:t>
             </w:r>
@@ -3770,6 +3988,7 @@
         <w:tc>
           <w:tcPr>
             <w:tcW w:type="dxa" w:w="960"/>
+            <w:noWrap/>
           </w:tcPr>
           <w:p>
             <w:pPr>
@@ -3777,7 +3996,7 @@
             </w:pPr>
             <w:r>
               <w:rPr>
-                <w:sz w:val="16"/>
+                <w:sz w:val="18"/>
               </w:rPr>
               <w:t>€2,779</w:t>
             </w:r>
@@ -3786,6 +4005,7 @@
         <w:tc>
           <w:tcPr>
             <w:tcW w:type="dxa" w:w="960"/>
+            <w:noWrap/>
           </w:tcPr>
           <w:p>
             <w:pPr>
@@ -3793,7 +4013,7 @@
             </w:pPr>
             <w:r>
               <w:rPr>
-                <w:sz w:val="16"/>
+                <w:sz w:val="18"/>
               </w:rPr>
               <w:t>38.9%</w:t>
             </w:r>
@@ -3802,6 +4022,7 @@
         <w:tc>
           <w:tcPr>
             <w:tcW w:type="dxa" w:w="960"/>
+            <w:noWrap/>
           </w:tcPr>
           <w:p>
             <w:pPr>
@@ -3809,7 +4030,7 @@
             </w:pPr>
             <w:r>
               <w:rPr>
-                <w:sz w:val="16"/>
+                <w:sz w:val="18"/>
               </w:rPr>
               <w:t>€1,654</w:t>
             </w:r>
@@ -3818,6 +4039,7 @@
         <w:tc>
           <w:tcPr>
             <w:tcW w:type="dxa" w:w="960"/>
+            <w:noWrap/>
           </w:tcPr>
           <w:p>
             <w:pPr>
@@ -3825,7 +4047,7 @@
             </w:pPr>
             <w:r>
               <w:rPr>
-                <w:sz w:val="16"/>
+                <w:sz w:val="18"/>
               </w:rPr>
               <w:t>17.5%</w:t>
             </w:r>
@@ -3834,6 +4056,7 @@
         <w:tc>
           <w:tcPr>
             <w:tcW w:type="dxa" w:w="960"/>
+            <w:noWrap/>
           </w:tcPr>
           <w:p>
             <w:pPr>
@@ -3841,7 +4064,7 @@
             </w:pPr>
             <w:r>
               <w:rPr>
-                <w:sz w:val="16"/>
+                <w:sz w:val="18"/>
               </w:rPr>
               <w:t>€1,603</w:t>
             </w:r>
@@ -3850,6 +4073,7 @@
         <w:tc>
           <w:tcPr>
             <w:tcW w:type="dxa" w:w="960"/>
+            <w:noWrap/>
           </w:tcPr>
           <w:p>
             <w:pPr>
@@ -3857,7 +4081,7 @@
             </w:pPr>
             <w:r>
               <w:rPr>
-                <w:sz w:val="16"/>
+                <w:sz w:val="18"/>
               </w:rPr>
               <w:t>16.4%</w:t>
             </w:r>
@@ -3866,6 +4090,7 @@
         <w:tc>
           <w:tcPr>
             <w:tcW w:type="dxa" w:w="960"/>
+            <w:noWrap/>
           </w:tcPr>
           <w:p>
             <w:pPr>
@@ -3874,7 +4099,7 @@
             <w:r>
               <w:rPr>
                 <w:color w:val="008000"/>
-                <w:sz w:val="16"/>
+                <w:sz w:val="18"/>
               </w:rPr>
               <w:t>+€1,125</w:t>
             </w:r>
@@ -3885,6 +4110,7 @@
         <w:tc>
           <w:tcPr>
             <w:tcW w:type="dxa" w:w="960"/>
+            <w:noWrap/>
           </w:tcPr>
           <w:p>
             <w:pPr>
@@ -3892,7 +4118,7 @@
             </w:pPr>
             <w:r>
               <w:rPr>
-                <w:sz w:val="16"/>
+                <w:sz w:val="18"/>
               </w:rPr>
               <w:t>2024</w:t>
             </w:r>
@@ -3901,6 +4127,7 @@
         <w:tc>
           <w:tcPr>
             <w:tcW w:type="dxa" w:w="960"/>
+            <w:noWrap/>
           </w:tcPr>
           <w:p>
             <w:pPr>
@@ -3908,7 +4135,7 @@
             </w:pPr>
             <w:r>
               <w:rPr>
-                <w:sz w:val="16"/>
+                <w:sz w:val="18"/>
               </w:rPr>
               <w:t>2</w:t>
             </w:r>
@@ -3917,6 +4144,7 @@
         <w:tc>
           <w:tcPr>
             <w:tcW w:type="dxa" w:w="960"/>
+            <w:noWrap/>
           </w:tcPr>
           <w:p>
             <w:pPr>
@@ -3924,7 +4152,7 @@
             </w:pPr>
             <w:r>
               <w:rPr>
-                <w:sz w:val="16"/>
+                <w:sz w:val="18"/>
               </w:rPr>
               <w:t>€2,617</w:t>
             </w:r>
@@ -3933,6 +4161,7 @@
         <w:tc>
           <w:tcPr>
             <w:tcW w:type="dxa" w:w="960"/>
+            <w:noWrap/>
           </w:tcPr>
           <w:p>
             <w:pPr>
@@ -3940,7 +4169,7 @@
             </w:pPr>
             <w:r>
               <w:rPr>
-                <w:sz w:val="16"/>
+                <w:sz w:val="18"/>
               </w:rPr>
               <w:t>57.6%</w:t>
             </w:r>
@@ -3949,6 +4178,7 @@
         <w:tc>
           <w:tcPr>
             <w:tcW w:type="dxa" w:w="960"/>
+            <w:noWrap/>
           </w:tcPr>
           <w:p>
             <w:pPr>
@@ -3956,7 +4186,7 @@
             </w:pPr>
             <w:r>
               <w:rPr>
-                <w:sz w:val="16"/>
+                <w:sz w:val="18"/>
               </w:rPr>
               <w:t>€1,400</w:t>
             </w:r>
@@ -3965,6 +4195,7 @@
         <w:tc>
           <w:tcPr>
             <w:tcW w:type="dxa" w:w="960"/>
+            <w:noWrap/>
           </w:tcPr>
           <w:p>
             <w:pPr>
@@ -3972,7 +4203,7 @@
             </w:pPr>
             <w:r>
               <w:rPr>
-                <w:sz w:val="16"/>
+                <w:sz w:val="18"/>
               </w:rPr>
               <w:t>17.3%</w:t>
             </w:r>
@@ -3981,6 +4212,7 @@
         <w:tc>
           <w:tcPr>
             <w:tcW w:type="dxa" w:w="960"/>
+            <w:noWrap/>
           </w:tcPr>
           <w:p>
             <w:pPr>
@@ -3988,7 +4220,7 @@
             </w:pPr>
             <w:r>
               <w:rPr>
-                <w:sz w:val="16"/>
+                <w:sz w:val="18"/>
               </w:rPr>
               <w:t>€1,453</w:t>
             </w:r>
@@ -3997,6 +4229,7 @@
         <w:tc>
           <w:tcPr>
             <w:tcW w:type="dxa" w:w="960"/>
+            <w:noWrap/>
           </w:tcPr>
           <w:p>
             <w:pPr>
@@ -4004,7 +4237,7 @@
             </w:pPr>
             <w:r>
               <w:rPr>
-                <w:sz w:val="16"/>
+                <w:sz w:val="18"/>
               </w:rPr>
               <w:t>19.3%</w:t>
             </w:r>
@@ -4013,6 +4246,7 @@
         <w:tc>
           <w:tcPr>
             <w:tcW w:type="dxa" w:w="960"/>
+            <w:noWrap/>
           </w:tcPr>
           <w:p>
             <w:pPr>
@@ -4021,7 +4255,7 @@
             <w:r>
               <w:rPr>
                 <w:color w:val="008000"/>
-                <w:sz w:val="16"/>
+                <w:sz w:val="18"/>
               </w:rPr>
               <w:t>+€1,164</w:t>
             </w:r>
@@ -4032,6 +4266,7 @@
         <w:tc>
           <w:tcPr>
             <w:tcW w:type="dxa" w:w="960"/>
+            <w:noWrap/>
           </w:tcPr>
           <w:p>
             <w:pPr>
@@ -4039,7 +4274,7 @@
             </w:pPr>
             <w:r>
               <w:rPr>
-                <w:sz w:val="16"/>
+                <w:sz w:val="18"/>
               </w:rPr>
               <w:t>2025</w:t>
             </w:r>
@@ -4048,6 +4283,7 @@
         <w:tc>
           <w:tcPr>
             <w:tcW w:type="dxa" w:w="960"/>
+            <w:noWrap/>
           </w:tcPr>
           <w:p>
             <w:pPr>
@@ -4055,7 +4291,7 @@
             </w:pPr>
             <w:r>
               <w:rPr>
-                <w:sz w:val="16"/>
+                <w:sz w:val="18"/>
               </w:rPr>
               <w:t>1</w:t>
             </w:r>
@@ -4064,6 +4300,7 @@
         <w:tc>
           <w:tcPr>
             <w:tcW w:type="dxa" w:w="960"/>
+            <w:noWrap/>
           </w:tcPr>
           <w:p>
             <w:pPr>
@@ -4071,7 +4308,7 @@
             </w:pPr>
             <w:r>
               <w:rPr>
-                <w:sz w:val="16"/>
+                <w:sz w:val="18"/>
               </w:rPr>
               <w:t>€1,987</w:t>
             </w:r>
@@ -4080,6 +4317,7 @@
         <w:tc>
           <w:tcPr>
             <w:tcW w:type="dxa" w:w="960"/>
+            <w:noWrap/>
           </w:tcPr>
           <w:p>
             <w:pPr>
@@ -4087,7 +4325,7 @@
             </w:pPr>
             <w:r>
               <w:rPr>
-                <w:sz w:val="16"/>
+                <w:sz w:val="18"/>
               </w:rPr>
               <w:t>85.5%</w:t>
             </w:r>
@@ -4096,6 +4334,7 @@
         <w:tc>
           <w:tcPr>
             <w:tcW w:type="dxa" w:w="960"/>
+            <w:noWrap/>
           </w:tcPr>
           <w:p>
             <w:pPr>
@@ -4103,7 +4342,7 @@
             </w:pPr>
             <w:r>
               <w:rPr>
-                <w:sz w:val="16"/>
+                <w:sz w:val="18"/>
               </w:rPr>
               <w:t>€1,188</w:t>
             </w:r>
@@ -4112,6 +4351,7 @@
         <w:tc>
           <w:tcPr>
             <w:tcW w:type="dxa" w:w="960"/>
+            <w:noWrap/>
           </w:tcPr>
           <w:p>
             <w:pPr>
@@ -4119,7 +4359,7 @@
             </w:pPr>
             <w:r>
               <w:rPr>
-                <w:sz w:val="16"/>
+                <w:sz w:val="18"/>
               </w:rPr>
               <w:t>16.7%</w:t>
             </w:r>
@@ -4128,6 +4368,7 @@
         <w:tc>
           <w:tcPr>
             <w:tcW w:type="dxa" w:w="960"/>
+            <w:noWrap/>
           </w:tcPr>
           <w:p>
             <w:pPr>
@@ -4135,7 +4376,7 @@
             </w:pPr>
             <w:r>
               <w:rPr>
-                <w:sz w:val="16"/>
+                <w:sz w:val="18"/>
               </w:rPr>
               <w:t>€1,257</w:t>
             </w:r>
@@ -4144,6 +4385,7 @@
         <w:tc>
           <w:tcPr>
             <w:tcW w:type="dxa" w:w="960"/>
+            <w:noWrap/>
           </w:tcPr>
           <w:p>
             <w:pPr>
@@ -4151,7 +4393,7 @@
             </w:pPr>
             <w:r>
               <w:rPr>
-                <w:sz w:val="16"/>
+                <w:sz w:val="18"/>
               </w:rPr>
               <w:t>22.9%</w:t>
             </w:r>
@@ -4160,6 +4402,7 @@
         <w:tc>
           <w:tcPr>
             <w:tcW w:type="dxa" w:w="960"/>
+            <w:noWrap/>
           </w:tcPr>
           <w:p>
             <w:pPr>
@@ -4168,7 +4411,7 @@
             <w:r>
               <w:rPr>
                 <w:color w:val="008000"/>
-                <w:sz w:val="16"/>
+                <w:sz w:val="18"/>
               </w:rPr>
               <w:t>+€730</w:t>
             </w:r>

</xml_diff>

<commit_message>
Add demographic headwind & net fund flow charts to DE and EN reports
Co-Authored-By: Claude Opus 4.6 <noreply@anthropic.com>
</commit_message>
<xml_diff>
--- a/Gold_vs_Aktien_Bericht.docx
+++ b/Gold_vs_Aktien_Bericht.docx
@@ -4694,6 +4694,57 @@
     </w:p>
     <w:p>
       <w:pPr>
+        <w:jc w:val="center"/>
+      </w:pPr>
+      <w:r>
+        <w:drawing>
+          <wp:inline xmlns:a="http://schemas.openxmlformats.org/drawingml/2006/main" xmlns:pic="http://schemas.openxmlformats.org/drawingml/2006/picture">
+            <wp:extent cx="5669280" cy="2362200"/>
+            <wp:docPr id="5" name="Picture 5"/>
+            <wp:cNvGraphicFramePr>
+              <a:graphicFrameLocks noChangeAspect="1"/>
+            </wp:cNvGraphicFramePr>
+            <a:graphic>
+              <a:graphicData uri="http://schemas.openxmlformats.org/drawingml/2006/picture">
+                <pic:pic>
+                  <pic:nvPicPr>
+                    <pic:cNvPr id="0" name="chart_demographic.png"/>
+                    <pic:cNvPicPr/>
+                  </pic:nvPicPr>
+                  <pic:blipFill>
+                    <a:blip r:embed="rId13"/>
+                    <a:stretch>
+                      <a:fillRect/>
+                    </a:stretch>
+                  </pic:blipFill>
+                  <pic:spPr>
+                    <a:xfrm>
+                      <a:off x="0" y="0"/>
+                      <a:ext cx="5669280" cy="2362200"/>
+                    </a:xfrm>
+                    <a:prstGeom prst="rect"/>
+                  </pic:spPr>
+                </pic:pic>
+              </a:graphicData>
+            </a:graphic>
+          </wp:inline>
+        </w:drawing>
+      </w:r>
+    </w:p>
+    <w:p>
+      <w:pPr>
+        <w:jc w:val="center"/>
+      </w:pPr>
+      <w:r>
+        <w:rPr>
+          <w:color w:val="555555"/>
+          <w:sz w:val="18"/>
+        </w:rPr>
+        <w:t>Abb. 5: Demografischer Gegenwind und Netto-Mittelflüsse in Aktienfonds</w:t>
+      </w:r>
+    </w:p>
+    <w:p>
+      <w:pPr>
         <w:pStyle w:val="Heading1"/>
       </w:pPr>
       <w:r>

</xml_diff>